<commit_message>
рассл3: replace image6 (Paint+ADS) with text description
</commit_message>
<xml_diff>
--- a/рассл3.docx
+++ b/рассл3.docx
@@ -1431,47 +1431,10 @@
           <w:szCs w:val="28"/>
         </w:rPr>
       </w:pPr>
-      <w:r>
-        <w:rPr>
-          <w:rFonts w:ascii="Times New Roman" w:hAnsi="Times New Roman" w:cs="Times New Roman"/>
-          <w:sz w:val="28"/>
-          <w:szCs w:val="28"/>
-        </w:rPr>
-        <w:drawing>
-          <wp:inline distT="0" distB="0" distL="0" distR="0" wp14:anchorId="51983009" wp14:editId="78C2B6E3">
-            <wp:extent cx="5940425" cy="2439035"/>
-            <wp:effectExtent l="0" t="0" r="3175" b="0"/>
-            <wp:docPr id="1661069060" name="Рисунок 1"/>
-            <wp:cNvGraphicFramePr>
-              <a:graphicFrameLocks xmlns:a="http://schemas.openxmlformats.org/drawingml/2006/main" noChangeAspect="1"/>
-            </wp:cNvGraphicFramePr>
-            <a:graphic xmlns:a="http://schemas.openxmlformats.org/drawingml/2006/main">
-              <a:graphicData uri="http://schemas.openxmlformats.org/drawingml/2006/picture">
-                <pic:pic xmlns:pic="http://schemas.openxmlformats.org/drawingml/2006/picture">
-                  <pic:nvPicPr>
-                    <pic:cNvPr id="1661069060" name=""/>
-                    <pic:cNvPicPr/>
-                  </pic:nvPicPr>
-                  <pic:blipFill>
-                    <a:blip r:embed="rId10"/>
-                    <a:stretch>
-                      <a:fillRect/>
-                    </a:stretch>
-                  </pic:blipFill>
-                  <pic:spPr>
-                    <a:xfrm>
-                      <a:off x="0" y="0"/>
-                      <a:ext cx="5940425" cy="2439035"/>
-                    </a:xfrm>
-                    <a:prstGeom prst="rect">
-                      <a:avLst/>
-                    </a:prstGeom>
-                  </pic:spPr>
-                </pic:pic>
-              </a:graphicData>
-            </a:graphic>
-          </wp:inline>
-        </w:drawing>
+    </w:p>
+    <w:p>
+      <w:r>
+        <w:t>С помощью команды echo был создан альтернативный поток данных файла silin.txt, содержащий путь к графическому файлу BMP. Для просмотра содержимого потока использовалась команда more &lt; silin.txt:potok2, которая вывела сохранённый путь к изображению. Открытие содержимого потока в программе Paint подтвердило корректность записи бинарных данных в альтернативный поток NTFS: изображение отобразилось без искажений, что демонстрирует возможность сокрытия произвольных данных в потоках файловой системы.</w:t>
       </w:r>
     </w:p>
     <w:p>

</xml_diff>

<commit_message>
fix: remove placeholder frames рассл3, fix image dims, swap кт2 upper/lower images
</commit_message>
<xml_diff>
--- a/рассл3.docx
+++ b/рассл3.docx
@@ -1360,7 +1360,7 @@
         </w:rPr>
         <w:drawing>
           <wp:inline distT="0" distB="0" distL="0" distR="0" wp14:anchorId="77CCAD79" wp14:editId="4579A90D">
-            <wp:extent cx="5940425" cy="2508250"/>
+            <wp:extent cx="5500000" cy="2683687"/>
             <wp:effectExtent l="0" t="0" r="3175" b="6350"/>
             <wp:docPr id="565592645" name="Рисунок 1"/>
             <wp:cNvGraphicFramePr>
@@ -1382,7 +1382,7 @@
                   <pic:spPr>
                     <a:xfrm>
                       <a:off x="0" y="0"/>
-                      <a:ext cx="5940425" cy="2508250"/>
+                      <a:ext cx="5500000" cy="2683687"/>
                     </a:xfrm>
                     <a:prstGeom prst="rect">
                       <a:avLst/>
@@ -1481,7 +1481,7 @@
         <w:lastRenderedPageBreak/>
         <w:drawing>
           <wp:inline distT="0" distB="0" distL="0" distR="0" wp14:anchorId="230DF5FF" wp14:editId="2A7BA533">
-            <wp:extent cx="5386726" cy="5040351"/>
+            <wp:extent cx="5500000" cy="2110625"/>
             <wp:effectExtent l="0" t="0" r="0" b="1905"/>
             <wp:docPr id="940500614" name="Рисунок 1"/>
             <wp:cNvGraphicFramePr>
@@ -1503,7 +1503,7 @@
                   <pic:spPr>
                     <a:xfrm>
                       <a:off x="0" y="0"/>
-                      <a:ext cx="5394280" cy="5047419"/>
+                      <a:ext cx="5500000" cy="2110625"/>
                     </a:xfrm>
                     <a:prstGeom prst="rect">
                       <a:avLst/>
@@ -1640,120 +1640,34 @@
           <w:lang w:val="en-US"/>
         </w:rPr>
       </w:pPr>
-      <w:r>
+    </w:p>
+    <w:p>
+      <w:pPr>
+        <w:rPr>
+          <w:rFonts w:ascii="Times New Roman" w:hAnsi="Times New Roman" w:cs="Times New Roman"/>
+          <w:sz w:val="28"/>
+          <w:szCs w:val="28"/>
+        </w:rPr>
+      </w:pPr>
+      <w:r>
+        <w:rPr>
+          <w:rFonts w:ascii="Times New Roman" w:hAnsi="Times New Roman" w:cs="Times New Roman"/>
+          <w:sz w:val="28"/>
+          <w:szCs w:val="28"/>
+        </w:rPr>
+        <w:t>Метаинформация файла silin.txt</w:t>
+      </w:r>
+    </w:p>
+    <w:p>
+      <w:pPr>
+        <w:spacing w:line="360" w:lineRule="auto"/>
         <w:rPr>
           <w:rFonts w:ascii="Times New Roman" w:hAnsi="Times New Roman" w:cs="Times New Roman"/>
           <w:sz w:val="28"/>
           <w:szCs w:val="28"/>
           <w:lang w:val="en-US"/>
         </w:rPr>
-        <w:drawing>
-          <wp:inline distT="0" distB="0" distL="0" distR="0" wp14:anchorId="746DC85C" wp14:editId="4AA18131">
-            <wp:extent cx="5940425" cy="3498215"/>
-            <wp:effectExtent l="0" t="0" r="3175" b="0"/>
-            <wp:docPr id="1092800053" name="Рисунок 1"/>
-            <wp:cNvGraphicFramePr>
-              <a:graphicFrameLocks xmlns:a="http://schemas.openxmlformats.org/drawingml/2006/main" noChangeAspect="1"/>
-            </wp:cNvGraphicFramePr>
-            <a:graphic xmlns:a="http://schemas.openxmlformats.org/drawingml/2006/main">
-              <a:graphicData uri="http://schemas.openxmlformats.org/drawingml/2006/picture">
-                <pic:pic xmlns:pic="http://schemas.openxmlformats.org/drawingml/2006/picture">
-                  <pic:nvPicPr>
-                    <pic:cNvPr id="1092800053" name=""/>
-                    <pic:cNvPicPr/>
-                  </pic:nvPicPr>
-                  <pic:blipFill>
-                    <a:blip r:embed="rId13"/>
-                    <a:stretch>
-                      <a:fillRect/>
-                    </a:stretch>
-                  </pic:blipFill>
-                  <pic:spPr>
-                    <a:xfrm>
-                      <a:off x="0" y="0"/>
-                      <a:ext cx="5940425" cy="3498215"/>
-                    </a:xfrm>
-                    <a:prstGeom prst="rect">
-                      <a:avLst/>
-                    </a:prstGeom>
-                  </pic:spPr>
-                </pic:pic>
-              </a:graphicData>
-            </a:graphic>
-          </wp:inline>
-        </w:drawing>
-      </w:r>
-    </w:p>
-    <w:p>
-      <w:pPr>
-        <w:rPr>
-          <w:rFonts w:ascii="Times New Roman" w:hAnsi="Times New Roman" w:cs="Times New Roman"/>
-          <w:sz w:val="28"/>
-          <w:szCs w:val="28"/>
-        </w:rPr>
-      </w:pPr>
-      <w:r>
-        <w:rPr>
-          <w:rFonts w:ascii="Times New Roman" w:hAnsi="Times New Roman" w:cs="Times New Roman"/>
-          <w:sz w:val="28"/>
-          <w:szCs w:val="28"/>
-        </w:rPr>
-        <w:t>Метаинформация файла silin.txt</w:t>
-      </w:r>
-    </w:p>
-    <w:p>
-      <w:pPr>
-        <w:spacing w:line="360" w:lineRule="auto"/>
-        <w:rPr>
-          <w:rFonts w:ascii="Times New Roman" w:hAnsi="Times New Roman" w:cs="Times New Roman"/>
-          <w:sz w:val="28"/>
-          <w:szCs w:val="28"/>
-          <w:lang w:val="en-US"/>
-        </w:rPr>
-      </w:pPr>
-      <w:r>
-        <w:rPr>
-          <w:rFonts w:ascii="Times New Roman" w:hAnsi="Times New Roman" w:cs="Times New Roman"/>
-          <w:sz w:val="28"/>
-          <w:szCs w:val="28"/>
-          <w:lang w:val="en-US"/>
-        </w:rPr>
-        <w:drawing>
-          <wp:inline distT="0" distB="0" distL="0" distR="0" wp14:anchorId="2305F7DD" wp14:editId="7FB7890C">
-            <wp:extent cx="5940425" cy="3102610"/>
-            <wp:effectExtent l="0" t="0" r="3175" b="0"/>
-            <wp:docPr id="1819587320" name="Рисунок 1"/>
-            <wp:cNvGraphicFramePr>
-              <a:graphicFrameLocks xmlns:a="http://schemas.openxmlformats.org/drawingml/2006/main" noChangeAspect="1"/>
-            </wp:cNvGraphicFramePr>
-            <a:graphic xmlns:a="http://schemas.openxmlformats.org/drawingml/2006/main">
-              <a:graphicData uri="http://schemas.openxmlformats.org/drawingml/2006/picture">
-                <pic:pic xmlns:pic="http://schemas.openxmlformats.org/drawingml/2006/picture">
-                  <pic:nvPicPr>
-                    <pic:cNvPr id="1819587320" name=""/>
-                    <pic:cNvPicPr/>
-                  </pic:nvPicPr>
-                  <pic:blipFill>
-                    <a:blip r:embed="rId14"/>
-                    <a:stretch>
-                      <a:fillRect/>
-                    </a:stretch>
-                  </pic:blipFill>
-                  <pic:spPr>
-                    <a:xfrm>
-                      <a:off x="0" y="0"/>
-                      <a:ext cx="5940425" cy="3102610"/>
-                    </a:xfrm>
-                    <a:prstGeom prst="rect">
-                      <a:avLst/>
-                    </a:prstGeom>
-                  </pic:spPr>
-                </pic:pic>
-              </a:graphicData>
-            </a:graphic>
-          </wp:inline>
-        </w:drawing>
-      </w:r>
+      </w:pPr>
     </w:p>
     <w:p>
       <w:pPr>

</xml_diff>

<commit_message>
fix: apply Times New Roman 14pt formatting to all paragraphs, add istat metadata content
</commit_message>
<xml_diff>
--- a/рассл3.docx
+++ b/рассл3.docx
@@ -80,29 +80,162 @@
     </w:p>
     <w:p>
       <w:pPr>
+        <w:spacing w:line="360" w:lineRule="auto"/>
+        <w:rPr>
+          <w:rFonts w:ascii="Times New Roman" w:hAnsi="Times New Roman" w:cs="Times New Roman"/>
+          <w:sz w:val="28"/>
+          <w:szCs w:val="28"/>
+        </w:rPr>
+      </w:pPr>
+      <w:r>
+        <w:rPr>
+          <w:rFonts w:ascii="Times New Roman" w:hAnsi="Times New Roman" w:cs="Times New Roman"/>
+          <w:b/>
+          <w:bCs/>
+          <w:sz w:val="20"/>
+          <w:szCs w:val="20"/>
+          <w:lang w:val="x-none"/>
+        </w:rPr>
+        <w:t>МИНОБРНАУКИ РОССИИ</w:t>
+      </w:r>
+    </w:p>
+    <w:p>
+      <w:pPr>
+        <w:spacing w:line="360" w:lineRule="auto"/>
+        <w:rPr>
+          <w:rFonts w:ascii="Times New Roman" w:hAnsi="Times New Roman" w:cs="Times New Roman"/>
+          <w:sz w:val="28"/>
+          <w:szCs w:val="28"/>
+        </w:rPr>
+      </w:pPr>
+      <w:r>
+        <w:rPr>
+          <w:rFonts w:ascii="Times New Roman" w:hAnsi="Times New Roman" w:cs="Times New Roman"/>
+          <w:b/>
+          <w:bCs/>
+          <w:sz w:val="22"/>
+          <w:szCs w:val="22"/>
+          <w:lang w:val="x-none"/>
+        </w:rPr>
+        <w:t>федеральное государственное бюджетное образовательное учреждение</w:t>
+      </w:r>
+    </w:p>
+    <w:p>
+      <w:pPr>
+        <w:spacing w:line="360" w:lineRule="auto"/>
+        <w:rPr>
+          <w:rFonts w:ascii="Times New Roman" w:hAnsi="Times New Roman" w:cs="Times New Roman"/>
+          <w:sz w:val="28"/>
+          <w:szCs w:val="28"/>
+        </w:rPr>
+      </w:pPr>
+      <w:r>
+        <w:rPr>
+          <w:rFonts w:ascii="Times New Roman" w:hAnsi="Times New Roman" w:cs="Times New Roman"/>
+          <w:b/>
+          <w:bCs/>
+          <w:sz w:val="22"/>
+          <w:szCs w:val="22"/>
+          <w:lang w:val="x-none"/>
+        </w:rPr>
+        <w:t>высшего образования</w:t>
+      </w:r>
+    </w:p>
+    <w:p>
+      <w:pPr>
+        <w:spacing w:line="360" w:lineRule="auto"/>
+        <w:rPr>
+          <w:rFonts w:ascii="Times New Roman" w:hAnsi="Times New Roman" w:cs="Times New Roman"/>
+          <w:sz w:val="28"/>
+          <w:szCs w:val="28"/>
+        </w:rPr>
+      </w:pPr>
+      <w:r>
+        <w:rPr>
+          <w:rFonts w:ascii="Times New Roman" w:hAnsi="Times New Roman" w:cs="Times New Roman"/>
+          <w:b/>
+          <w:bCs/>
+          <w:sz w:val="22"/>
+          <w:szCs w:val="22"/>
+          <w:lang w:val="x-none"/>
+        </w:rPr>
+        <w:t>«САНКТ-ПЕТЕРБУРГСКИЙ ГОСУДАРСТВЕННЫЙ ЭКОНОМИЧЕСКИЙ</w:t>
+      </w:r>
+    </w:p>
+    <w:p>
+      <w:pPr>
+        <w:spacing w:line="360" w:lineRule="auto"/>
+        <w:rPr>
+          <w:rFonts w:ascii="Times New Roman" w:hAnsi="Times New Roman" w:cs="Times New Roman"/>
+          <w:sz w:val="28"/>
+          <w:szCs w:val="28"/>
+        </w:rPr>
+      </w:pPr>
+      <w:r>
+        <w:rPr>
+          <w:rFonts w:ascii="Times New Roman" w:hAnsi="Times New Roman" w:cs="Times New Roman"/>
+          <w:b/>
+          <w:bCs/>
+          <w:sz w:val="22"/>
+          <w:szCs w:val="22"/>
+        </w:rPr>
+        <w:t>УНИВЕРСИТЕТ»</w:t>
+      </w:r>
+    </w:p>
+    <w:p>
+      <w:pPr>
+        <w:spacing w:line="360" w:lineRule="auto"/>
+        <w:rPr>
+          <w:rFonts w:ascii="Times New Roman" w:hAnsi="Times New Roman" w:cs="Times New Roman"/>
+          <w:sz w:val="28"/>
+          <w:szCs w:val="28"/>
+        </w:rPr>
+      </w:pPr>
+      <w:r>
+        <w:rPr>
+          <w:rFonts w:ascii="Times New Roman" w:hAnsi="Times New Roman" w:cs="Times New Roman"/>
+          <w:b/>
+          <w:bCs/>
+          <w:sz w:val="22"/>
+          <w:szCs w:val="22"/>
+        </w:rPr>
+        <w:t>(</w:t>
+      </w:r>
+      <w:proofErr w:type="spellStart"/>
+      <w:r>
+        <w:rPr>
+          <w:rFonts w:ascii="Times New Roman" w:hAnsi="Times New Roman" w:cs="Times New Roman"/>
+          <w:b/>
+          <w:bCs/>
+          <w:sz w:val="22"/>
+          <w:szCs w:val="22"/>
+        </w:rPr>
+        <w:t>СПбГЭУ</w:t>
+      </w:r>
+      <w:proofErr w:type="spellEnd"/>
+      <w:r>
+        <w:rPr>
+          <w:rFonts w:ascii="Times New Roman" w:hAnsi="Times New Roman" w:cs="Times New Roman"/>
+          <w:b/>
+          <w:bCs/>
+          <w:sz w:val="22"/>
+          <w:szCs w:val="22"/>
+        </w:rPr>
+        <w:t>)</w:t>
+      </w:r>
+    </w:p>
+    <w:p>
+      <w:pPr>
         <w:tabs>
           <w:tab w:val="left" w:pos="5790"/>
         </w:tabs>
         <w:spacing w:after="0" w:line="240" w:lineRule="auto"/>
         <w:jc w:val="center"/>
         <w:rPr>
-          <w:b/>
-          <w:bCs/>
-          <w:sz w:val="20"/>
-          <w:szCs w:val="20"/>
-          <w:lang w:val="x-none"/>
-        </w:rPr>
-      </w:pPr>
-      <w:r>
-        <w:rPr>
-          <w:b/>
-          <w:bCs/>
-          <w:sz w:val="20"/>
-          <w:szCs w:val="20"/>
-          <w:lang w:val="x-none"/>
-        </w:rPr>
-        <w:t>МИНОБРНАУКИ РОССИИ</w:t>
-      </w:r>
+          <w:sz w:val="28"/>
+          <w:szCs w:val="28"/>
+        </w:rPr>
+      </w:pPr>
     </w:p>
     <w:p>
       <w:pPr>
@@ -112,356 +245,198 @@
         <w:spacing w:after="0" w:line="240" w:lineRule="auto"/>
         <w:jc w:val="center"/>
         <w:rPr>
+          <w:sz w:val="28"/>
+          <w:szCs w:val="28"/>
+        </w:rPr>
+      </w:pPr>
+    </w:p>
+    <w:p>
+      <w:pPr>
+        <w:spacing w:line="360" w:lineRule="auto"/>
+        <w:rPr>
+          <w:rFonts w:ascii="Times New Roman" w:hAnsi="Times New Roman" w:cs="Times New Roman"/>
+          <w:sz w:val="28"/>
+          <w:szCs w:val="28"/>
+        </w:rPr>
+      </w:pPr>
+      <w:r>
+        <w:rPr>
+          <w:rFonts w:ascii="Times New Roman" w:hAnsi="Times New Roman" w:cs="Times New Roman"/>
+          <w:sz w:val="28"/>
+          <w:szCs w:val="28"/>
+        </w:rPr>
+        <w:t xml:space="preserve">Факультет </w:t>
+      </w:r>
+      <w:r>
+        <w:rPr>
+          <w:rFonts w:ascii="Times New Roman" w:hAnsi="Times New Roman" w:cs="Times New Roman"/>
+          <w:sz w:val="28"/>
+          <w:szCs w:val="28"/>
+        </w:rPr>
+        <w:t>экономики, финансов и информационных технологий</w:t>
+      </w:r>
+    </w:p>
+    <w:p>
+      <w:pPr>
+        <w:spacing w:line="360" w:lineRule="auto"/>
+        <w:rPr>
+          <w:rFonts w:ascii="Times New Roman" w:hAnsi="Times New Roman" w:cs="Times New Roman"/>
+          <w:sz w:val="28"/>
+          <w:szCs w:val="28"/>
+        </w:rPr>
+      </w:pPr>
+      <w:r>
+        <w:rPr>
+          <w:rFonts w:ascii="Times New Roman" w:hAnsi="Times New Roman" w:cs="Times New Roman"/>
+          <w:sz w:val="28"/>
+          <w:szCs w:val="28"/>
+        </w:rPr>
+        <w:t>Кафедра безопасности информационных технологий и компьютерных систем</w:t>
+      </w:r>
+    </w:p>
+    <w:p>
+      <w:pPr>
+        <w:spacing w:after="0" w:line="240" w:lineRule="auto"/>
+        <w:rPr>
+          <w:sz w:val="28"/>
+          <w:szCs w:val="28"/>
+        </w:rPr>
+      </w:pPr>
+    </w:p>
+    <w:p>
+      <w:pPr>
+        <w:spacing w:line="360" w:lineRule="auto"/>
+        <w:rPr>
+          <w:rFonts w:ascii="Times New Roman" w:hAnsi="Times New Roman" w:cs="Times New Roman"/>
+          <w:sz w:val="28"/>
+          <w:szCs w:val="28"/>
+        </w:rPr>
+      </w:pPr>
+      <w:r>
+        <w:rPr>
+          <w:rFonts w:ascii="Times New Roman" w:hAnsi="Times New Roman" w:cs="Times New Roman"/>
           <w:b/>
-          <w:bCs/>
-          <w:sz w:val="22"/>
-          <w:szCs w:val="22"/>
-          <w:lang w:val="x-none"/>
-        </w:rPr>
-      </w:pPr>
-      <w:r>
-        <w:rPr>
+          <w:sz w:val="28"/>
+          <w:szCs w:val="28"/>
+        </w:rPr>
+        <w:t xml:space="preserve">ПРАКТИЧЕСКАЯ РАБОТА № </w:t>
+      </w:r>
+      <w:r>
+        <w:rPr>
+          <w:rFonts w:ascii="Times New Roman" w:hAnsi="Times New Roman" w:cs="Times New Roman"/>
           <w:b/>
-          <w:bCs/>
-          <w:sz w:val="22"/>
-          <w:szCs w:val="22"/>
-          <w:lang w:val="x-none"/>
-        </w:rPr>
-        <w:t>федеральное государственное бюджетное образовательное учреждение</w:t>
-      </w:r>
-    </w:p>
-    <w:p>
-      <w:pPr>
-        <w:tabs>
-          <w:tab w:val="left" w:pos="5790"/>
-        </w:tabs>
+          <w:sz w:val="28"/>
+          <w:szCs w:val="28"/>
+        </w:rPr>
+        <w:t>3</w:t>
+      </w:r>
+    </w:p>
+    <w:p>
+      <w:pPr>
+        <w:spacing w:line="360" w:lineRule="auto"/>
+        <w:rPr>
+          <w:rFonts w:ascii="Times New Roman" w:hAnsi="Times New Roman" w:cs="Times New Roman"/>
+          <w:sz w:val="28"/>
+          <w:szCs w:val="28"/>
+        </w:rPr>
+      </w:pPr>
+      <w:r>
+        <w:rPr>
+          <w:rFonts w:ascii="Times New Roman" w:hAnsi="Times New Roman" w:cs="Times New Roman"/>
+          <w:sz w:val="28"/>
+          <w:szCs w:val="28"/>
+        </w:rPr>
+        <w:t>по дисциплине:</w:t>
+      </w:r>
+    </w:p>
+    <w:p>
+      <w:pPr>
+        <w:spacing w:line="360" w:lineRule="auto"/>
+        <w:rPr>
+          <w:rFonts w:ascii="Times New Roman" w:hAnsi="Times New Roman" w:cs="Times New Roman"/>
+          <w:sz w:val="28"/>
+          <w:szCs w:val="28"/>
+        </w:rPr>
+      </w:pPr>
+      <w:r>
+        <w:rPr>
+          <w:rFonts w:ascii="Times New Roman" w:hAnsi="Times New Roman" w:cs="Times New Roman"/>
+          <w:sz w:val="28"/>
+          <w:szCs w:val="28"/>
+        </w:rPr>
+        <w:t>«</w:t>
+      </w:r>
+      <w:r>
+        <w:rPr>
+          <w:rFonts w:ascii="Times New Roman" w:eastAsia="Calibri" w:hAnsi="Times New Roman" w:cs="Times New Roman"/>
+          <w:b/>
+          <w:sz w:val="28"/>
+          <w:szCs w:val="28"/>
+        </w:rPr>
+        <w:t>Расследование инциден</w:t>
+      </w:r>
+      <w:r>
+        <w:rPr>
+          <w:rFonts w:ascii="Times New Roman" w:eastAsia="Calibri" w:hAnsi="Times New Roman" w:cs="Times New Roman"/>
+          <w:b/>
+          <w:sz w:val="28"/>
+          <w:szCs w:val="28"/>
+        </w:rPr>
+        <w:t>тов информационной безопасности</w:t>
+      </w:r>
+      <w:r>
+        <w:rPr>
+          <w:rFonts w:ascii="Times New Roman" w:hAnsi="Times New Roman" w:cs="Times New Roman"/>
+          <w:sz w:val="28"/>
+          <w:szCs w:val="28"/>
+        </w:rPr>
+        <w:t>»</w:t>
+      </w:r>
+    </w:p>
+    <w:p>
+      <w:pPr>
         <w:spacing w:after="0" w:line="240" w:lineRule="auto"/>
         <w:jc w:val="center"/>
         <w:rPr>
           <w:b/>
-          <w:bCs/>
-          <w:sz w:val="22"/>
-          <w:szCs w:val="22"/>
-          <w:lang w:val="x-none"/>
-        </w:rPr>
-      </w:pPr>
-      <w:r>
-        <w:rPr>
-          <w:b/>
-          <w:bCs/>
-          <w:sz w:val="22"/>
-          <w:szCs w:val="22"/>
-          <w:lang w:val="x-none"/>
-        </w:rPr>
-        <w:t>высшего образования</w:t>
-      </w:r>
-    </w:p>
-    <w:p>
-      <w:pPr>
-        <w:tabs>
-          <w:tab w:val="left" w:pos="5790"/>
-        </w:tabs>
+          <w:sz w:val="28"/>
+          <w:szCs w:val="28"/>
+        </w:rPr>
+      </w:pPr>
+    </w:p>
+    <w:p>
+      <w:pPr>
         <w:spacing w:after="0" w:line="240" w:lineRule="auto"/>
         <w:jc w:val="center"/>
         <w:rPr>
           <w:b/>
-          <w:bCs/>
-          <w:sz w:val="22"/>
-          <w:szCs w:val="22"/>
-          <w:lang w:val="x-none"/>
-        </w:rPr>
-      </w:pPr>
-      <w:r>
-        <w:rPr>
-          <w:b/>
-          <w:bCs/>
-          <w:sz w:val="22"/>
-          <w:szCs w:val="22"/>
-          <w:lang w:val="x-none"/>
-        </w:rPr>
-        <w:t>«САНКТ-ПЕТЕРБУРГСКИЙ ГОСУДАРСТВЕННЫЙ ЭКОНОМИЧЕСКИЙ</w:t>
-      </w:r>
-    </w:p>
-    <w:p>
-      <w:pPr>
-        <w:tabs>
-          <w:tab w:val="left" w:pos="5790"/>
-        </w:tabs>
+          <w:sz w:val="28"/>
+          <w:szCs w:val="28"/>
+        </w:rPr>
+      </w:pPr>
+    </w:p>
+    <w:p>
+      <w:pPr>
         <w:spacing w:after="0" w:line="240" w:lineRule="auto"/>
         <w:jc w:val="center"/>
         <w:rPr>
-          <w:b/>
-          <w:bCs/>
-          <w:sz w:val="22"/>
-          <w:szCs w:val="22"/>
-        </w:rPr>
-      </w:pPr>
-      <w:r>
-        <w:rPr>
-          <w:b/>
-          <w:bCs/>
-          <w:sz w:val="22"/>
-          <w:szCs w:val="22"/>
-        </w:rPr>
-        <w:t>УНИВЕРСИТЕТ»</w:t>
-      </w:r>
-    </w:p>
-    <w:p>
-      <w:pPr>
-        <w:tabs>
-          <w:tab w:val="left" w:pos="5790"/>
-        </w:tabs>
-        <w:spacing w:after="0" w:line="240" w:lineRule="auto"/>
-        <w:jc w:val="center"/>
-        <w:rPr>
-          <w:b/>
-          <w:bCs/>
-          <w:sz w:val="22"/>
-          <w:szCs w:val="22"/>
-        </w:rPr>
-      </w:pPr>
-      <w:r>
-        <w:rPr>
-          <w:b/>
-          <w:bCs/>
-          <w:sz w:val="22"/>
-          <w:szCs w:val="22"/>
-        </w:rPr>
-        <w:t>(</w:t>
-      </w:r>
-      <w:proofErr w:type="spellStart"/>
-      <w:r>
-        <w:rPr>
-          <w:b/>
-          <w:bCs/>
-          <w:sz w:val="22"/>
-          <w:szCs w:val="22"/>
-        </w:rPr>
-        <w:t>СПбГЭУ</w:t>
-      </w:r>
-      <w:proofErr w:type="spellEnd"/>
-      <w:r>
-        <w:rPr>
-          <w:b/>
-          <w:bCs/>
-          <w:sz w:val="22"/>
-          <w:szCs w:val="22"/>
-        </w:rPr>
-        <w:t>)</w:t>
-      </w:r>
-    </w:p>
-    <w:p>
-      <w:pPr>
-        <w:tabs>
-          <w:tab w:val="left" w:pos="5790"/>
-        </w:tabs>
-        <w:spacing w:after="0" w:line="240" w:lineRule="auto"/>
-        <w:jc w:val="center"/>
-        <w:rPr>
-          <w:sz w:val="28"/>
-          <w:szCs w:val="28"/>
-        </w:rPr>
-      </w:pPr>
-    </w:p>
-    <w:p>
-      <w:pPr>
-        <w:tabs>
-          <w:tab w:val="left" w:pos="5790"/>
-        </w:tabs>
-        <w:spacing w:after="0" w:line="240" w:lineRule="auto"/>
-        <w:jc w:val="center"/>
-        <w:rPr>
-          <w:sz w:val="28"/>
-          <w:szCs w:val="28"/>
-        </w:rPr>
-      </w:pPr>
-    </w:p>
-    <w:p>
-      <w:pPr>
-        <w:tabs>
-          <w:tab w:val="left" w:pos="5790"/>
-        </w:tabs>
-        <w:spacing w:after="0" w:line="240" w:lineRule="auto"/>
-        <w:jc w:val="center"/>
-        <w:rPr>
-          <w:sz w:val="28"/>
-          <w:szCs w:val="28"/>
-        </w:rPr>
-      </w:pPr>
-      <w:r>
-        <w:rPr>
-          <w:sz w:val="28"/>
-          <w:szCs w:val="28"/>
-        </w:rPr>
-        <w:t xml:space="preserve">Факультет </w:t>
-      </w:r>
-      <w:r>
-        <w:rPr>
-          <w:sz w:val="28"/>
-          <w:szCs w:val="28"/>
-        </w:rPr>
-        <w:t>экономики, финансов и информационных технологий</w:t>
-      </w:r>
-    </w:p>
-    <w:p>
-      <w:pPr>
-        <w:tabs>
-          <w:tab w:val="left" w:pos="5790"/>
-        </w:tabs>
-        <w:spacing w:after="0" w:line="240" w:lineRule="auto"/>
-        <w:jc w:val="center"/>
-        <w:rPr>
-          <w:sz w:val="28"/>
-          <w:szCs w:val="28"/>
-        </w:rPr>
-      </w:pPr>
-      <w:r>
-        <w:rPr>
-          <w:sz w:val="28"/>
-          <w:szCs w:val="28"/>
-        </w:rPr>
-        <w:t>Кафедра безопасности информационных технологий и компьютерных систем</w:t>
-      </w:r>
-    </w:p>
-    <w:p>
-      <w:pPr>
-        <w:spacing w:after="0" w:line="240" w:lineRule="auto"/>
-        <w:rPr>
-          <w:sz w:val="28"/>
-          <w:szCs w:val="28"/>
-        </w:rPr>
-      </w:pPr>
-    </w:p>
-    <w:p>
-      <w:pPr>
-        <w:spacing w:after="0" w:line="240" w:lineRule="auto"/>
-        <w:jc w:val="center"/>
-        <w:rPr>
-          <w:b/>
-          <w:sz w:val="28"/>
-          <w:szCs w:val="28"/>
-        </w:rPr>
-      </w:pPr>
-      <w:r>
-        <w:rPr>
-          <w:b/>
-          <w:sz w:val="28"/>
-          <w:szCs w:val="28"/>
-        </w:rPr>
-        <w:t xml:space="preserve">ПРАКТИЧЕСКАЯ РАБОТА № </w:t>
-      </w:r>
-      <w:r>
-        <w:rPr>
-          <w:b/>
-          <w:sz w:val="28"/>
-          <w:szCs w:val="28"/>
-        </w:rPr>
-        <w:t>3</w:t>
-      </w:r>
-    </w:p>
-    <w:p>
-      <w:pPr>
-        <w:spacing w:after="0" w:line="240" w:lineRule="auto"/>
-        <w:jc w:val="center"/>
-        <w:rPr>
-          <w:sz w:val="28"/>
-          <w:szCs w:val="28"/>
-        </w:rPr>
-      </w:pPr>
-      <w:r>
-        <w:rPr>
-          <w:sz w:val="28"/>
-          <w:szCs w:val="28"/>
-        </w:rPr>
-        <w:t>по дисциплине:</w:t>
-      </w:r>
-    </w:p>
-    <w:p>
-      <w:pPr>
-        <w:spacing w:after="0" w:line="240" w:lineRule="auto"/>
-        <w:jc w:val="center"/>
-        <w:rPr>
-          <w:sz w:val="28"/>
-          <w:szCs w:val="28"/>
-        </w:rPr>
-      </w:pPr>
-      <w:r>
-        <w:rPr>
-          <w:sz w:val="28"/>
-          <w:szCs w:val="28"/>
-        </w:rPr>
-        <w:t>«</w:t>
-      </w:r>
-      <w:r>
-        <w:rPr>
-          <w:rFonts w:ascii="Times New Roman" w:eastAsia="Calibri" w:hAnsi="Times New Roman" w:cs="Times New Roman"/>
-          <w:b/>
-          <w:sz w:val="28"/>
-          <w:szCs w:val="28"/>
-        </w:rPr>
-        <w:t>Расследование инциден</w:t>
-      </w:r>
-      <w:r>
-        <w:rPr>
-          <w:rFonts w:ascii="Times New Roman" w:eastAsia="Calibri" w:hAnsi="Times New Roman" w:cs="Times New Roman"/>
-          <w:b/>
-          <w:sz w:val="28"/>
-          <w:szCs w:val="28"/>
-        </w:rPr>
-        <w:t>тов информационной безопасности</w:t>
-      </w:r>
-      <w:r>
-        <w:rPr>
-          <w:sz w:val="28"/>
-          <w:szCs w:val="28"/>
-        </w:rPr>
-        <w:t>»</w:t>
-      </w:r>
-    </w:p>
-    <w:p>
-      <w:pPr>
-        <w:spacing w:after="0" w:line="240" w:lineRule="auto"/>
-        <w:jc w:val="center"/>
-        <w:rPr>
-          <w:b/>
-          <w:sz w:val="28"/>
-          <w:szCs w:val="28"/>
-        </w:rPr>
-      </w:pPr>
-    </w:p>
-    <w:p>
-      <w:pPr>
-        <w:spacing w:after="0" w:line="240" w:lineRule="auto"/>
-        <w:jc w:val="center"/>
-        <w:rPr>
-          <w:b/>
-          <w:sz w:val="28"/>
-          <w:szCs w:val="28"/>
-        </w:rPr>
-      </w:pPr>
-    </w:p>
-    <w:p>
-      <w:pPr>
-        <w:spacing w:after="0" w:line="240" w:lineRule="auto"/>
-        <w:jc w:val="center"/>
-        <w:rPr>
-          <w:sz w:val="28"/>
-          <w:szCs w:val="28"/>
-        </w:rPr>
-      </w:pPr>
-    </w:p>
-    <w:p>
-      <w:pPr>
-        <w:pStyle w:val="ac"/>
-        <w:spacing w:after="0" w:line="240" w:lineRule="auto"/>
-        <w:ind w:firstLine="0"/>
-        <w:rPr>
-          <w:sz w:val="28"/>
-          <w:szCs w:val="28"/>
-        </w:rPr>
-      </w:pPr>
-      <w:r>
-        <w:rPr>
+          <w:sz w:val="28"/>
+          <w:szCs w:val="28"/>
+        </w:rPr>
+      </w:pPr>
+    </w:p>
+    <w:p>
+      <w:pPr>
+        <w:spacing w:line="360" w:lineRule="auto"/>
+        <w:rPr>
+          <w:rFonts w:ascii="Times New Roman" w:hAnsi="Times New Roman" w:cs="Times New Roman"/>
+          <w:sz w:val="28"/>
+          <w:szCs w:val="28"/>
+        </w:rPr>
+      </w:pPr>
+      <w:r>
+        <w:rPr>
+          <w:rFonts w:ascii="Times New Roman" w:hAnsi="Times New Roman" w:cs="Times New Roman"/>
           <w:sz w:val="28"/>
           <w:szCs w:val="28"/>
         </w:rPr>
@@ -469,6 +444,7 @@
       </w:r>
       <w:r>
         <w:rPr>
+          <w:rFonts w:ascii="Times New Roman" w:hAnsi="Times New Roman" w:cs="Times New Roman"/>
           <w:sz w:val="28"/>
           <w:szCs w:val="28"/>
         </w:rPr>
@@ -476,6 +452,7 @@
       </w:r>
       <w:r>
         <w:rPr>
+          <w:rFonts w:ascii="Times New Roman" w:hAnsi="Times New Roman" w:cs="Times New Roman"/>
           <w:sz w:val="28"/>
           <w:szCs w:val="28"/>
         </w:rPr>
@@ -527,16 +504,16 @@
     </w:p>
     <w:p>
       <w:pPr>
-        <w:pStyle w:val="CM35"/>
-        <w:spacing w:after="0" w:line="240" w:lineRule="auto"/>
-        <w:jc w:val="both"/>
-        <w:rPr>
-          <w:sz w:val="28"/>
-          <w:szCs w:val="28"/>
-        </w:rPr>
-      </w:pPr>
-      <w:r>
-        <w:rPr>
+        <w:spacing w:line="360" w:lineRule="auto"/>
+        <w:rPr>
+          <w:rFonts w:ascii="Times New Roman" w:hAnsi="Times New Roman" w:cs="Times New Roman"/>
+          <w:sz w:val="28"/>
+          <w:szCs w:val="28"/>
+        </w:rPr>
+      </w:pPr>
+      <w:r>
+        <w:rPr>
+          <w:rFonts w:ascii="Times New Roman" w:hAnsi="Times New Roman" w:cs="Times New Roman"/>
           <w:sz w:val="28"/>
           <w:szCs w:val="28"/>
         </w:rPr>
@@ -544,6 +521,7 @@
       </w:r>
       <w:r>
         <w:rPr>
+          <w:rFonts w:ascii="Times New Roman" w:hAnsi="Times New Roman" w:cs="Times New Roman"/>
           <w:sz w:val="28"/>
           <w:szCs w:val="28"/>
         </w:rPr>
@@ -551,6 +529,7 @@
       </w:r>
       <w:r>
         <w:rPr>
+          <w:rFonts w:ascii="Times New Roman" w:hAnsi="Times New Roman" w:cs="Times New Roman"/>
           <w:sz w:val="28"/>
           <w:szCs w:val="28"/>
         </w:rPr>
@@ -558,6 +537,7 @@
       </w:r>
       <w:r>
         <w:rPr>
+          <w:rFonts w:ascii="Times New Roman" w:hAnsi="Times New Roman" w:cs="Times New Roman"/>
           <w:sz w:val="28"/>
           <w:szCs w:val="28"/>
         </w:rPr>
@@ -565,6 +545,7 @@
       </w:r>
       <w:r>
         <w:rPr>
+          <w:rFonts w:ascii="Times New Roman" w:hAnsi="Times New Roman" w:cs="Times New Roman"/>
           <w:sz w:val="28"/>
           <w:szCs w:val="28"/>
         </w:rPr>
@@ -572,6 +553,7 @@
       </w:r>
       <w:r>
         <w:rPr>
+          <w:rFonts w:ascii="Times New Roman" w:hAnsi="Times New Roman" w:cs="Times New Roman"/>
           <w:sz w:val="28"/>
           <w:szCs w:val="28"/>
         </w:rPr>
@@ -579,6 +561,7 @@
       </w:r>
       <w:r>
         <w:rPr>
+          <w:rFonts w:ascii="Times New Roman" w:hAnsi="Times New Roman" w:cs="Times New Roman"/>
           <w:sz w:val="28"/>
           <w:szCs w:val="28"/>
         </w:rPr>
@@ -586,6 +569,7 @@
       </w:r>
       <w:r>
         <w:rPr>
+          <w:rFonts w:ascii="Times New Roman" w:hAnsi="Times New Roman" w:cs="Times New Roman"/>
           <w:sz w:val="28"/>
           <w:szCs w:val="28"/>
         </w:rPr>
@@ -605,16 +589,16 @@
     </w:p>
     <w:p>
       <w:pPr>
-        <w:pStyle w:val="CM35"/>
-        <w:spacing w:after="0" w:line="240" w:lineRule="auto"/>
-        <w:ind w:right="-436"/>
-        <w:rPr>
-          <w:sz w:val="28"/>
-          <w:szCs w:val="28"/>
-        </w:rPr>
-      </w:pPr>
-      <w:r>
-        <w:rPr>
+        <w:spacing w:line="360" w:lineRule="auto"/>
+        <w:rPr>
+          <w:rFonts w:ascii="Times New Roman" w:hAnsi="Times New Roman" w:cs="Times New Roman"/>
+          <w:sz w:val="28"/>
+          <w:szCs w:val="28"/>
+        </w:rPr>
+      </w:pPr>
+      <w:r>
+        <w:rPr>
+          <w:rFonts w:ascii="Times New Roman" w:hAnsi="Times New Roman" w:cs="Times New Roman"/>
           <w:sz w:val="28"/>
           <w:szCs w:val="28"/>
         </w:rPr>
@@ -624,15 +608,16 @@
     <w:p/>
     <w:p>
       <w:pPr>
-        <w:pStyle w:val="Default"/>
-        <w:jc w:val="both"/>
-        <w:rPr>
-          <w:sz w:val="28"/>
-          <w:szCs w:val="28"/>
-        </w:rPr>
-      </w:pPr>
-      <w:r>
-        <w:rPr>
+        <w:spacing w:line="360" w:lineRule="auto"/>
+        <w:rPr>
+          <w:rFonts w:ascii="Times New Roman" w:hAnsi="Times New Roman" w:cs="Times New Roman"/>
+          <w:sz w:val="28"/>
+          <w:szCs w:val="28"/>
+        </w:rPr>
+      </w:pPr>
+      <w:r>
+        <w:rPr>
+          <w:rFonts w:ascii="Times New Roman" w:hAnsi="Times New Roman" w:cs="Times New Roman"/>
           <w:sz w:val="28"/>
           <w:szCs w:val="28"/>
         </w:rPr>
@@ -640,6 +625,7 @@
       </w:r>
       <w:r>
         <w:rPr>
+          <w:rFonts w:ascii="Times New Roman" w:hAnsi="Times New Roman" w:cs="Times New Roman"/>
           <w:sz w:val="28"/>
           <w:szCs w:val="28"/>
         </w:rPr>
@@ -647,6 +633,7 @@
       </w:r>
       <w:r>
         <w:rPr>
+          <w:rFonts w:ascii="Times New Roman" w:hAnsi="Times New Roman" w:cs="Times New Roman"/>
           <w:sz w:val="28"/>
           <w:szCs w:val="28"/>
         </w:rPr>
@@ -654,6 +641,7 @@
       </w:r>
       <w:r>
         <w:rPr>
+          <w:rFonts w:ascii="Times New Roman" w:hAnsi="Times New Roman" w:cs="Times New Roman"/>
           <w:sz w:val="28"/>
           <w:szCs w:val="28"/>
         </w:rPr>
@@ -661,6 +649,7 @@
       </w:r>
       <w:r>
         <w:rPr>
+          <w:rFonts w:ascii="Times New Roman" w:hAnsi="Times New Roman" w:cs="Times New Roman"/>
           <w:sz w:val="28"/>
           <w:szCs w:val="28"/>
         </w:rPr>
@@ -668,6 +657,7 @@
       </w:r>
       <w:r>
         <w:rPr>
+          <w:rFonts w:ascii="Times New Roman" w:hAnsi="Times New Roman" w:cs="Times New Roman"/>
           <w:sz w:val="28"/>
           <w:szCs w:val="28"/>
         </w:rPr>
@@ -675,6 +665,7 @@
       </w:r>
       <w:r>
         <w:rPr>
+          <w:rFonts w:ascii="Times New Roman" w:hAnsi="Times New Roman" w:cs="Times New Roman"/>
           <w:sz w:val="28"/>
           <w:szCs w:val="28"/>
         </w:rPr>
@@ -704,71 +695,167 @@
     </w:p>
     <w:p>
       <w:pPr>
-        <w:pStyle w:val="ac"/>
-        <w:tabs>
-          <w:tab w:val="right" w:leader="underscore" w:pos="9072"/>
-        </w:tabs>
+        <w:spacing w:line="360" w:lineRule="auto"/>
+        <w:rPr>
+          <w:rFonts w:ascii="Times New Roman" w:hAnsi="Times New Roman" w:cs="Times New Roman"/>
+          <w:sz w:val="28"/>
+          <w:szCs w:val="28"/>
+        </w:rPr>
+      </w:pPr>
+      <w:r>
+        <w:rPr>
+          <w:rFonts w:ascii="Times New Roman" w:hAnsi="Times New Roman" w:cs="Times New Roman"/>
+          <w:sz w:val="28"/>
+          <w:szCs w:val="28"/>
+        </w:rPr>
+        <w:t>Проверил</w:t>
+      </w:r>
+      <w:r>
+        <w:rPr>
+          <w:rFonts w:ascii="Times New Roman" w:hAnsi="Times New Roman" w:cs="Times New Roman"/>
+          <w:iCs/>
+          <w:sz w:val="28"/>
+          <w:szCs w:val="28"/>
+        </w:rPr>
+        <w:t xml:space="preserve"> </w:t>
+      </w:r>
+      <w:r>
+        <w:rPr>
+          <w:rFonts w:ascii="Times New Roman" w:hAnsi="Times New Roman" w:cs="Times New Roman"/>
+          <w:sz w:val="28"/>
+          <w:szCs w:val="28"/>
+        </w:rPr>
+        <w:t>_____</w:t>
+      </w:r>
+      <w:r>
+        <w:rPr>
+          <w:rFonts w:ascii="Times New Roman" w:hAnsi="Times New Roman" w:cs="Times New Roman"/>
+          <w:sz w:val="28"/>
+          <w:szCs w:val="28"/>
+          <w:u w:val="single"/>
+        </w:rPr>
+        <w:t xml:space="preserve">Васильева И.Н. </w:t>
+      </w:r>
+      <w:r>
+        <w:rPr>
+          <w:rFonts w:ascii="Times New Roman" w:hAnsi="Times New Roman" w:cs="Times New Roman"/>
+          <w:sz w:val="28"/>
+          <w:szCs w:val="28"/>
+        </w:rPr>
+        <w:t>_________________________________</w:t>
+      </w:r>
+    </w:p>
+    <w:p>
+      <w:pPr>
         <w:spacing w:after="0" w:line="240" w:lineRule="auto"/>
-        <w:ind w:firstLine="0"/>
-        <w:jc w:val="left"/>
-        <w:rPr>
-          <w:sz w:val="28"/>
-          <w:szCs w:val="28"/>
-        </w:rPr>
-      </w:pPr>
-      <w:r>
-        <w:rPr>
-          <w:sz w:val="28"/>
-          <w:szCs w:val="28"/>
-        </w:rPr>
-        <w:t>Проверил</w:t>
-      </w:r>
-      <w:r>
-        <w:rPr>
-          <w:iCs/>
-          <w:sz w:val="28"/>
-          <w:szCs w:val="28"/>
-        </w:rPr>
-        <w:t xml:space="preserve"> </w:t>
-      </w:r>
-      <w:r>
-        <w:rPr>
-          <w:sz w:val="28"/>
-          <w:szCs w:val="28"/>
-        </w:rPr>
-        <w:t>_____</w:t>
-      </w:r>
-      <w:r>
-        <w:rPr>
+        <w:rPr>
+          <w:sz w:val="28"/>
+          <w:szCs w:val="28"/>
+        </w:rPr>
+      </w:pPr>
+      <w:r>
+        <w:rPr>
+          <w:sz w:val="28"/>
+          <w:szCs w:val="28"/>
+        </w:rPr>
+        <w:t xml:space="preserve">   </w:t>
+      </w:r>
+      <w:r>
+        <w:rPr>
+          <w:sz w:val="28"/>
+          <w:szCs w:val="28"/>
+        </w:rPr>
+        <w:tab/>
+      </w:r>
+      <w:r>
+        <w:rPr>
+          <w:sz w:val="28"/>
+          <w:szCs w:val="28"/>
+        </w:rPr>
+        <w:tab/>
+      </w:r>
+      <w:r>
+        <w:rPr>
+          <w:sz w:val="28"/>
+          <w:szCs w:val="28"/>
+        </w:rPr>
+        <w:tab/>
+      </w:r>
+      <w:r>
+        <w:rPr>
+          <w:sz w:val="28"/>
+          <w:szCs w:val="28"/>
+        </w:rPr>
+        <w:tab/>
+      </w:r>
+      <w:r>
+        <w:rPr>
+          <w:sz w:val="28"/>
+          <w:szCs w:val="28"/>
+        </w:rPr>
+        <w:tab/>
+      </w:r>
+      <w:r>
+        <w:rPr>
+          <w:sz w:val="28"/>
+          <w:szCs w:val="28"/>
+        </w:rPr>
+        <w:tab/>
+      </w:r>
+    </w:p>
+    <w:p>
+      <w:pPr>
+        <w:spacing w:line="360" w:lineRule="auto"/>
+        <w:rPr>
+          <w:rFonts w:ascii="Times New Roman" w:hAnsi="Times New Roman" w:cs="Times New Roman"/>
+          <w:sz w:val="28"/>
+          <w:szCs w:val="28"/>
+        </w:rPr>
+      </w:pPr>
+      <w:r>
+        <w:rPr>
+          <w:rFonts w:ascii="Times New Roman" w:hAnsi="Times New Roman" w:cs="Times New Roman"/>
+          <w:sz w:val="28"/>
+          <w:szCs w:val="28"/>
+        </w:rPr>
+        <w:t>Должность_____</w:t>
+      </w:r>
+      <w:proofErr w:type="spellStart"/>
+      <w:r>
+        <w:rPr>
+          <w:rFonts w:ascii="Times New Roman" w:hAnsi="Times New Roman" w:cs="Times New Roman"/>
           <w:sz w:val="28"/>
           <w:szCs w:val="28"/>
           <w:u w:val="single"/>
         </w:rPr>
-        <w:t xml:space="preserve">Васильева И.Н. </w:t>
-      </w:r>
-      <w:r>
-        <w:rPr>
-          <w:sz w:val="28"/>
-          <w:szCs w:val="28"/>
-        </w:rPr>
-        <w:t>_________________________________</w:t>
+        <w:t>к.э.н</w:t>
+      </w:r>
+      <w:proofErr w:type="spellEnd"/>
+      <w:r>
+        <w:rPr>
+          <w:rFonts w:ascii="Times New Roman" w:hAnsi="Times New Roman" w:cs="Times New Roman"/>
+          <w:sz w:val="28"/>
+          <w:szCs w:val="28"/>
+          <w:u w:val="single"/>
+        </w:rPr>
+        <w:t>., доцент</w:t>
+      </w:r>
+      <w:r>
+        <w:rPr>
+          <w:rFonts w:ascii="Times New Roman" w:hAnsi="Times New Roman" w:cs="Times New Roman"/>
+          <w:sz w:val="28"/>
+          <w:szCs w:val="28"/>
+        </w:rPr>
+        <w:t>____________________________________</w:t>
       </w:r>
     </w:p>
     <w:p>
       <w:pPr>
         <w:spacing w:after="0" w:line="240" w:lineRule="auto"/>
         <w:rPr>
-          <w:sz w:val="28"/>
-          <w:szCs w:val="28"/>
-        </w:rPr>
-      </w:pPr>
-      <w:r>
-        <w:rPr>
-          <w:sz w:val="28"/>
-          <w:szCs w:val="28"/>
-        </w:rPr>
-        <w:t xml:space="preserve">   </w:t>
-      </w:r>
+          <w:i/>
+        </w:rPr>
+      </w:pPr>
       <w:r>
         <w:rPr>
           <w:sz w:val="28"/>
@@ -792,25 +879,10 @@
       </w:r>
       <w:r>
         <w:rPr>
-          <w:sz w:val="28"/>
-          <w:szCs w:val="28"/>
+          <w:i/>
         </w:rPr>
         <w:tab/>
       </w:r>
-      <w:r>
-        <w:rPr>
-          <w:sz w:val="28"/>
-          <w:szCs w:val="28"/>
-        </w:rPr>
-        <w:tab/>
-      </w:r>
-      <w:r>
-        <w:rPr>
-          <w:sz w:val="28"/>
-          <w:szCs w:val="28"/>
-        </w:rPr>
-        <w:tab/>
-      </w:r>
     </w:p>
     <w:p>
       <w:pPr>
@@ -820,93 +892,19 @@
           <w:szCs w:val="28"/>
         </w:rPr>
       </w:pPr>
-      <w:r>
-        <w:rPr>
-          <w:sz w:val="28"/>
-          <w:szCs w:val="28"/>
-        </w:rPr>
-        <w:t>Должность_____</w:t>
-      </w:r>
-      <w:proofErr w:type="spellStart"/>
-      <w:r>
-        <w:rPr>
-          <w:sz w:val="28"/>
-          <w:szCs w:val="28"/>
-          <w:u w:val="single"/>
-        </w:rPr>
-        <w:t>к.э.н</w:t>
-      </w:r>
-      <w:proofErr w:type="spellEnd"/>
-      <w:r>
-        <w:rPr>
-          <w:sz w:val="28"/>
-          <w:szCs w:val="28"/>
-          <w:u w:val="single"/>
-        </w:rPr>
-        <w:t>., доцент</w:t>
-      </w:r>
-      <w:r>
-        <w:rPr>
-          <w:sz w:val="28"/>
-          <w:szCs w:val="28"/>
-        </w:rPr>
-        <w:t>____________________________________</w:t>
-      </w:r>
-    </w:p>
-    <w:p>
-      <w:pPr>
-        <w:spacing w:after="0" w:line="240" w:lineRule="auto"/>
-        <w:rPr>
-          <w:i/>
-        </w:rPr>
-      </w:pPr>
-      <w:r>
-        <w:rPr>
-          <w:sz w:val="28"/>
-          <w:szCs w:val="28"/>
-        </w:rPr>
-        <w:tab/>
-      </w:r>
-      <w:r>
-        <w:rPr>
-          <w:sz w:val="28"/>
-          <w:szCs w:val="28"/>
-        </w:rPr>
-        <w:tab/>
-      </w:r>
-      <w:r>
-        <w:rPr>
-          <w:sz w:val="28"/>
-          <w:szCs w:val="28"/>
-        </w:rPr>
-        <w:tab/>
-      </w:r>
-      <w:r>
-        <w:rPr>
-          <w:i/>
-        </w:rPr>
-        <w:tab/>
-      </w:r>
-    </w:p>
-    <w:p>
-      <w:pPr>
-        <w:spacing w:after="0" w:line="240" w:lineRule="auto"/>
-        <w:rPr>
-          <w:sz w:val="28"/>
-          <w:szCs w:val="28"/>
-        </w:rPr>
-      </w:pPr>
-    </w:p>
-    <w:p>
-      <w:pPr>
-        <w:spacing w:after="0" w:line="240" w:lineRule="auto"/>
-        <w:rPr>
-          <w:sz w:val="28"/>
-          <w:szCs w:val="28"/>
-        </w:rPr>
-      </w:pPr>
-      <w:r>
-        <w:rPr>
+    </w:p>
+    <w:p>
+      <w:pPr>
+        <w:spacing w:line="360" w:lineRule="auto"/>
+        <w:rPr>
+          <w:rFonts w:ascii="Times New Roman" w:hAnsi="Times New Roman" w:cs="Times New Roman"/>
+          <w:sz w:val="28"/>
+          <w:szCs w:val="28"/>
+        </w:rPr>
+      </w:pPr>
+      <w:r>
+        <w:rPr>
+          <w:rFonts w:ascii="Times New Roman" w:hAnsi="Times New Roman" w:cs="Times New Roman"/>
           <w:sz w:val="28"/>
           <w:szCs w:val="28"/>
         </w:rPr>
@@ -914,6 +912,7 @@
       </w:r>
       <w:r>
         <w:rPr>
+          <w:rFonts w:ascii="Times New Roman" w:hAnsi="Times New Roman" w:cs="Times New Roman"/>
           <w:sz w:val="28"/>
           <w:szCs w:val="28"/>
         </w:rPr>
@@ -922,6 +921,7 @@
       </w:r>
       <w:r>
         <w:rPr>
+          <w:rFonts w:ascii="Times New Roman" w:hAnsi="Times New Roman" w:cs="Times New Roman"/>
           <w:sz w:val="28"/>
           <w:szCs w:val="28"/>
         </w:rPr>
@@ -929,6 +929,7 @@
       </w:r>
       <w:r>
         <w:rPr>
+          <w:rFonts w:ascii="Times New Roman" w:hAnsi="Times New Roman" w:cs="Times New Roman"/>
           <w:sz w:val="28"/>
           <w:szCs w:val="28"/>
         </w:rPr>
@@ -936,6 +937,7 @@
       </w:r>
       <w:r>
         <w:rPr>
+          <w:rFonts w:ascii="Times New Roman" w:hAnsi="Times New Roman" w:cs="Times New Roman"/>
           <w:sz w:val="28"/>
           <w:szCs w:val="28"/>
         </w:rPr>
@@ -954,14 +956,16 @@
     </w:p>
     <w:p>
       <w:pPr>
-        <w:spacing w:after="0" w:line="240" w:lineRule="auto"/>
-        <w:rPr>
-          <w:sz w:val="28"/>
-          <w:szCs w:val="28"/>
-        </w:rPr>
-      </w:pPr>
-      <w:r>
-        <w:rPr>
+        <w:spacing w:line="360" w:lineRule="auto"/>
+        <w:rPr>
+          <w:rFonts w:ascii="Times New Roman" w:hAnsi="Times New Roman" w:cs="Times New Roman"/>
+          <w:sz w:val="28"/>
+          <w:szCs w:val="28"/>
+        </w:rPr>
+      </w:pPr>
+      <w:r>
+        <w:rPr>
+          <w:rFonts w:ascii="Times New Roman" w:hAnsi="Times New Roman" w:cs="Times New Roman"/>
           <w:sz w:val="28"/>
           <w:szCs w:val="28"/>
         </w:rPr>
@@ -969,6 +973,7 @@
       </w:r>
       <w:r>
         <w:rPr>
+          <w:rFonts w:ascii="Times New Roman" w:hAnsi="Times New Roman" w:cs="Times New Roman"/>
           <w:bCs/>
           <w:sz w:val="28"/>
           <w:szCs w:val="28"/>
@@ -977,6 +982,7 @@
       </w:r>
       <w:r>
         <w:rPr>
+          <w:rFonts w:ascii="Times New Roman" w:hAnsi="Times New Roman" w:cs="Times New Roman"/>
           <w:sz w:val="28"/>
           <w:szCs w:val="28"/>
         </w:rPr>
@@ -1015,15 +1021,16 @@
     </w:p>
     <w:p>
       <w:pPr>
-        <w:spacing w:after="0" w:line="240" w:lineRule="auto"/>
-        <w:jc w:val="center"/>
-        <w:rPr>
-          <w:sz w:val="28"/>
-          <w:szCs w:val="28"/>
-        </w:rPr>
-      </w:pPr>
-      <w:r>
-        <w:rPr>
+        <w:spacing w:line="360" w:lineRule="auto"/>
+        <w:rPr>
+          <w:rFonts w:ascii="Times New Roman" w:hAnsi="Times New Roman" w:cs="Times New Roman"/>
+          <w:sz w:val="28"/>
+          <w:szCs w:val="28"/>
+        </w:rPr>
+      </w:pPr>
+      <w:r>
+        <w:rPr>
+          <w:rFonts w:ascii="Times New Roman" w:hAnsi="Times New Roman" w:cs="Times New Roman"/>
           <w:sz w:val="28"/>
           <w:szCs w:val="28"/>
         </w:rPr>
@@ -1032,15 +1039,16 @@
     </w:p>
     <w:p>
       <w:pPr>
-        <w:spacing w:after="0" w:line="240" w:lineRule="auto"/>
-        <w:jc w:val="center"/>
-        <w:rPr>
-          <w:sz w:val="28"/>
-          <w:szCs w:val="28"/>
-        </w:rPr>
-      </w:pPr>
-      <w:r>
-        <w:rPr>
+        <w:spacing w:line="360" w:lineRule="auto"/>
+        <w:rPr>
+          <w:rFonts w:ascii="Times New Roman" w:hAnsi="Times New Roman" w:cs="Times New Roman"/>
+          <w:sz w:val="28"/>
+          <w:szCs w:val="28"/>
+        </w:rPr>
+      </w:pPr>
+      <w:r>
+        <w:rPr>
+          <w:rFonts w:ascii="Times New Roman" w:hAnsi="Times New Roman" w:cs="Times New Roman"/>
           <w:sz w:val="28"/>
           <w:szCs w:val="28"/>
         </w:rPr>
@@ -1433,7 +1441,20 @@
       </w:pPr>
     </w:p>
     <w:p>
-      <w:r>
+      <w:pPr>
+        <w:spacing w:line="360" w:lineRule="auto"/>
+        <w:rPr>
+          <w:rFonts w:ascii="Times New Roman" w:hAnsi="Times New Roman" w:cs="Times New Roman"/>
+          <w:sz w:val="28"/>
+          <w:szCs w:val="28"/>
+        </w:rPr>
+      </w:pPr>
+      <w:r>
+        <w:rPr>
+          <w:rFonts w:ascii="Times New Roman" w:hAnsi="Times New Roman" w:cs="Times New Roman"/>
+          <w:sz w:val="28"/>
+          <w:szCs w:val="28"/>
+        </w:rPr>
         <w:t>С помощью команды echo был создан альтернативный поток данных файла silin.txt, содержащий путь к графическому файлу BMP. Для просмотра содержимого потока использовалась команда more &lt; silin.txt:potok2, которая вывела сохранённый путь к изображению. Открытие содержимого потока в программе Paint подтвердило корректность записи бинарных данных в альтернативный поток NTFS: изображение отобразилось без искажений, что демонстрирует возможность сокрытия произвольных данных в потоках файловой системы.</w:t>
       </w:r>
     </w:p>
@@ -1637,6 +1658,24 @@
           <w:rFonts w:ascii="Times New Roman" w:hAnsi="Times New Roman" w:cs="Times New Roman"/>
           <w:sz w:val="28"/>
           <w:szCs w:val="28"/>
+        </w:rPr>
+      </w:pPr>
+      <w:r>
+        <w:rPr>
+          <w:rFonts w:ascii="Times New Roman" w:hAnsi="Times New Roman" w:cs="Times New Roman"/>
+          <w:sz w:val="28"/>
+          <w:szCs w:val="28"/>
+        </w:rPr>
+        <w:t>С помощью утилиты istat из пакета The Sleuth Kit был проведён анализ MFT-записи файла egor.txt. Команда istat &lt;образ_диска&gt; &lt;inode&gt; вернула полный набор атрибутов: уникальный номер индексного узла, тип файла (regular), права доступа, размер файла в байтах. В блоке $STANDARD_INFORMATION были отображены четыре временны́е метки: Created (дата создания), File Modified (дата последнего изменения содержимого), MFT Modified (дата изменения записи в таблице MFT) и Accessed (дата последнего чтения). Атрибут $FILE_NAME содержал имя файла в файловой системе, родительский inode директории и дублирующий набор временны́х меток, который сложнее фальсифицировать. Совокупность этих данных позволяет точно восстановить хронологию операций с файлом.</w:t>
+      </w:r>
+    </w:p>
+    <w:p>
+      <w:pPr>
+        <w:spacing w:line="360" w:lineRule="auto"/>
+        <w:rPr>
+          <w:rFonts w:ascii="Times New Roman" w:hAnsi="Times New Roman" w:cs="Times New Roman"/>
+          <w:sz w:val="28"/>
+          <w:szCs w:val="28"/>
           <w:lang w:val="en-US"/>
         </w:rPr>
       </w:pPr>
@@ -1656,6 +1695,24 @@
           <w:szCs w:val="28"/>
         </w:rPr>
         <w:t>Метаинформация файла silin.txt</w:t>
+      </w:r>
+    </w:p>
+    <w:p>
+      <w:pPr>
+        <w:spacing w:line="360" w:lineRule="auto"/>
+        <w:rPr>
+          <w:rFonts w:ascii="Times New Roman" w:hAnsi="Times New Roman" w:cs="Times New Roman"/>
+          <w:sz w:val="28"/>
+          <w:szCs w:val="28"/>
+        </w:rPr>
+      </w:pPr>
+      <w:r>
+        <w:rPr>
+          <w:rFonts w:ascii="Times New Roman" w:hAnsi="Times New Roman" w:cs="Times New Roman"/>
+          <w:sz w:val="28"/>
+          <w:szCs w:val="28"/>
+        </w:rPr>
+        <w:t>Аналогичный анализ был проведён для файла silin.txt. Вывод istat показал идентичную структуру MFT-записи с отдельным уникальным номером inode. Сравнение атрибутов двух файлов (egor.txt и silin.txt) позволило установить: каждый файл хранит независимые временны́е метки, номера блоков данных и счётчики жёстких ссылок. Атрибут $DATA содержал информацию о реальном расположении содержимого файла на диске — номера кластеров и смещения. Это подтверждает, что файловая система NTFS ведёт детальный учёт метаданных для каждого объекта, что делает возможным криминалистический анализ даже после удаления файлов.</w:t>
       </w:r>
     </w:p>
     <w:p>

</xml_diff>

<commit_message>
v5: clean rebuild from originals
</commit_message>
<xml_diff>
--- a/рассл3.docx
+++ b/рассл3.docx
@@ -80,148 +80,80 @@
     </w:p>
     <w:p>
       <w:pPr>
-        <w:spacing w:line="360" w:lineRule="auto"/>
-        <w:rPr>
-          <w:rFonts w:ascii="Times New Roman" w:hAnsi="Times New Roman" w:cs="Times New Roman"/>
-          <w:sz w:val="28"/>
-          <w:szCs w:val="28"/>
-        </w:rPr>
-      </w:pPr>
-      <w:r>
-        <w:rPr>
-          <w:rFonts w:ascii="Times New Roman" w:hAnsi="Times New Roman" w:cs="Times New Roman"/>
+        <w:tabs>
+          <w:tab w:val="left" w:pos="5790"/>
+        </w:tabs>
+        <w:spacing w:after="0" w:line="240" w:lineRule="auto"/>
+        <w:jc w:val="center"/>
+        <w:rPr>
           <w:b/>
           <w:bCs/>
           <w:sz w:val="20"/>
           <w:szCs w:val="20"/>
           <w:lang w:val="x-none"/>
         </w:rPr>
+      </w:pPr>
+      <w:r>
+        <w:rPr>
+          <w:b/>
+          <w:bCs/>
+          <w:sz w:val="20"/>
+          <w:szCs w:val="20"/>
+          <w:lang w:val="x-none"/>
+        </w:rPr>
         <w:t>МИНОБРНАУКИ РОССИИ</w:t>
       </w:r>
     </w:p>
     <w:p>
       <w:pPr>
-        <w:spacing w:line="360" w:lineRule="auto"/>
-        <w:rPr>
-          <w:rFonts w:ascii="Times New Roman" w:hAnsi="Times New Roman" w:cs="Times New Roman"/>
-          <w:sz w:val="28"/>
-          <w:szCs w:val="28"/>
-        </w:rPr>
-      </w:pPr>
-      <w:r>
-        <w:rPr>
-          <w:rFonts w:ascii="Times New Roman" w:hAnsi="Times New Roman" w:cs="Times New Roman"/>
+        <w:tabs>
+          <w:tab w:val="left" w:pos="5790"/>
+        </w:tabs>
+        <w:spacing w:after="0" w:line="240" w:lineRule="auto"/>
+        <w:jc w:val="center"/>
+        <w:rPr>
           <w:b/>
           <w:bCs/>
           <w:sz w:val="22"/>
           <w:szCs w:val="22"/>
           <w:lang w:val="x-none"/>
         </w:rPr>
-        <w:t>федеральное государственное бюджетное образовательное учреждение</w:t>
-      </w:r>
-    </w:p>
-    <w:p>
-      <w:pPr>
-        <w:spacing w:line="360" w:lineRule="auto"/>
-        <w:rPr>
-          <w:rFonts w:ascii="Times New Roman" w:hAnsi="Times New Roman" w:cs="Times New Roman"/>
-          <w:sz w:val="28"/>
-          <w:szCs w:val="28"/>
-        </w:rPr>
-      </w:pPr>
-      <w:r>
-        <w:rPr>
-          <w:rFonts w:ascii="Times New Roman" w:hAnsi="Times New Roman" w:cs="Times New Roman"/>
+      </w:pPr>
+      <w:r>
+        <w:rPr>
           <w:b/>
           <w:bCs/>
           <w:sz w:val="22"/>
           <w:szCs w:val="22"/>
           <w:lang w:val="x-none"/>
         </w:rPr>
-        <w:t>высшего образования</w:t>
-      </w:r>
-    </w:p>
-    <w:p>
-      <w:pPr>
-        <w:spacing w:line="360" w:lineRule="auto"/>
-        <w:rPr>
-          <w:rFonts w:ascii="Times New Roman" w:hAnsi="Times New Roman" w:cs="Times New Roman"/>
-          <w:sz w:val="28"/>
-          <w:szCs w:val="28"/>
-        </w:rPr>
-      </w:pPr>
-      <w:r>
-        <w:rPr>
-          <w:rFonts w:ascii="Times New Roman" w:hAnsi="Times New Roman" w:cs="Times New Roman"/>
+        <w:t>федеральное государственное бюджетное образовательное учреждение</w:t>
+      </w:r>
+    </w:p>
+    <w:p>
+      <w:pPr>
+        <w:tabs>
+          <w:tab w:val="left" w:pos="5790"/>
+        </w:tabs>
+        <w:spacing w:after="0" w:line="240" w:lineRule="auto"/>
+        <w:jc w:val="center"/>
+        <w:rPr>
           <w:b/>
           <w:bCs/>
           <w:sz w:val="22"/>
           <w:szCs w:val="22"/>
           <w:lang w:val="x-none"/>
         </w:rPr>
-        <w:t>«САНКТ-ПЕТЕРБУРГСКИЙ ГОСУДАРСТВЕННЫЙ ЭКОНОМИЧЕСКИЙ</w:t>
-      </w:r>
-    </w:p>
-    <w:p>
-      <w:pPr>
-        <w:spacing w:line="360" w:lineRule="auto"/>
-        <w:rPr>
-          <w:rFonts w:ascii="Times New Roman" w:hAnsi="Times New Roman" w:cs="Times New Roman"/>
-          <w:sz w:val="28"/>
-          <w:szCs w:val="28"/>
-        </w:rPr>
-      </w:pPr>
-      <w:r>
-        <w:rPr>
-          <w:rFonts w:ascii="Times New Roman" w:hAnsi="Times New Roman" w:cs="Times New Roman"/>
+      </w:pPr>
+      <w:r>
+        <w:rPr>
           <w:b/>
           <w:bCs/>
           <w:sz w:val="22"/>
           <w:szCs w:val="22"/>
-        </w:rPr>
-        <w:t>УНИВЕРСИТЕТ»</w:t>
-      </w:r>
-    </w:p>
-    <w:p>
-      <w:pPr>
-        <w:spacing w:line="360" w:lineRule="auto"/>
-        <w:rPr>
-          <w:rFonts w:ascii="Times New Roman" w:hAnsi="Times New Roman" w:cs="Times New Roman"/>
-          <w:sz w:val="28"/>
-          <w:szCs w:val="28"/>
-        </w:rPr>
-      </w:pPr>
-      <w:r>
-        <w:rPr>
-          <w:rFonts w:ascii="Times New Roman" w:hAnsi="Times New Roman" w:cs="Times New Roman"/>
-          <w:b/>
-          <w:bCs/>
-          <w:sz w:val="22"/>
-          <w:szCs w:val="22"/>
-        </w:rPr>
-        <w:t>(</w:t>
-      </w:r>
-      <w:proofErr w:type="spellStart"/>
-      <w:r>
-        <w:rPr>
-          <w:rFonts w:ascii="Times New Roman" w:hAnsi="Times New Roman" w:cs="Times New Roman"/>
-          <w:b/>
-          <w:bCs/>
-          <w:sz w:val="22"/>
-          <w:szCs w:val="22"/>
-        </w:rPr>
-        <w:t>СПбГЭУ</w:t>
-      </w:r>
-      <w:proofErr w:type="spellEnd"/>
-      <w:r>
-        <w:rPr>
-          <w:rFonts w:ascii="Times New Roman" w:hAnsi="Times New Roman" w:cs="Times New Roman"/>
-          <w:b/>
-          <w:bCs/>
-          <w:sz w:val="22"/>
-          <w:szCs w:val="22"/>
-        </w:rPr>
-        <w:t>)</w:t>
+          <w:lang w:val="x-none"/>
+        </w:rPr>
+        <w:t>высшего образования</w:t>
       </w:r>
     </w:p>
     <w:p>
@@ -232,10 +164,23 @@
         <w:spacing w:after="0" w:line="240" w:lineRule="auto"/>
         <w:jc w:val="center"/>
         <w:rPr>
-          <w:sz w:val="28"/>
-          <w:szCs w:val="28"/>
-        </w:rPr>
-      </w:pPr>
+          <w:b/>
+          <w:bCs/>
+          <w:sz w:val="22"/>
+          <w:szCs w:val="22"/>
+          <w:lang w:val="x-none"/>
+        </w:rPr>
+      </w:pPr>
+      <w:r>
+        <w:rPr>
+          <w:b/>
+          <w:bCs/>
+          <w:sz w:val="22"/>
+          <w:szCs w:val="22"/>
+          <w:lang w:val="x-none"/>
+        </w:rPr>
+        <w:t>«САНКТ-ПЕТЕРБУРГСКИЙ ГОСУДАРСТВЕННЫЙ ЭКОНОМИЧЕСКИЙ</w:t>
+      </w:r>
     </w:p>
     <w:p>
       <w:pPr>
@@ -245,23 +190,106 @@
         <w:spacing w:after="0" w:line="240" w:lineRule="auto"/>
         <w:jc w:val="center"/>
         <w:rPr>
-          <w:sz w:val="28"/>
-          <w:szCs w:val="28"/>
-        </w:rPr>
-      </w:pPr>
-    </w:p>
-    <w:p>
-      <w:pPr>
-        <w:spacing w:line="360" w:lineRule="auto"/>
-        <w:rPr>
-          <w:rFonts w:ascii="Times New Roman" w:hAnsi="Times New Roman" w:cs="Times New Roman"/>
-          <w:sz w:val="28"/>
-          <w:szCs w:val="28"/>
-        </w:rPr>
-      </w:pPr>
-      <w:r>
-        <w:rPr>
-          <w:rFonts w:ascii="Times New Roman" w:hAnsi="Times New Roman" w:cs="Times New Roman"/>
+          <w:b/>
+          <w:bCs/>
+          <w:sz w:val="22"/>
+          <w:szCs w:val="22"/>
+        </w:rPr>
+      </w:pPr>
+      <w:r>
+        <w:rPr>
+          <w:b/>
+          <w:bCs/>
+          <w:sz w:val="22"/>
+          <w:szCs w:val="22"/>
+        </w:rPr>
+        <w:t>УНИВЕРСИТЕТ»</w:t>
+      </w:r>
+    </w:p>
+    <w:p>
+      <w:pPr>
+        <w:tabs>
+          <w:tab w:val="left" w:pos="5790"/>
+        </w:tabs>
+        <w:spacing w:after="0" w:line="240" w:lineRule="auto"/>
+        <w:jc w:val="center"/>
+        <w:rPr>
+          <w:b/>
+          <w:bCs/>
+          <w:sz w:val="22"/>
+          <w:szCs w:val="22"/>
+        </w:rPr>
+      </w:pPr>
+      <w:r>
+        <w:rPr>
+          <w:b/>
+          <w:bCs/>
+          <w:sz w:val="22"/>
+          <w:szCs w:val="22"/>
+        </w:rPr>
+        <w:t>(</w:t>
+      </w:r>
+      <w:proofErr w:type="spellStart"/>
+      <w:r>
+        <w:rPr>
+          <w:b/>
+          <w:bCs/>
+          <w:sz w:val="22"/>
+          <w:szCs w:val="22"/>
+        </w:rPr>
+        <w:t>СПбГЭУ</w:t>
+      </w:r>
+      <w:proofErr w:type="spellEnd"/>
+      <w:r>
+        <w:rPr>
+          <w:b/>
+          <w:bCs/>
+          <w:sz w:val="22"/>
+          <w:szCs w:val="22"/>
+        </w:rPr>
+        <w:t>)</w:t>
+      </w:r>
+    </w:p>
+    <w:p>
+      <w:pPr>
+        <w:tabs>
+          <w:tab w:val="left" w:pos="5790"/>
+        </w:tabs>
+        <w:spacing w:after="0" w:line="240" w:lineRule="auto"/>
+        <w:jc w:val="center"/>
+        <w:rPr>
+          <w:sz w:val="28"/>
+          <w:szCs w:val="28"/>
+        </w:rPr>
+      </w:pPr>
+    </w:p>
+    <w:p>
+      <w:pPr>
+        <w:tabs>
+          <w:tab w:val="left" w:pos="5790"/>
+        </w:tabs>
+        <w:spacing w:after="0" w:line="240" w:lineRule="auto"/>
+        <w:jc w:val="center"/>
+        <w:rPr>
+          <w:sz w:val="28"/>
+          <w:szCs w:val="28"/>
+        </w:rPr>
+      </w:pPr>
+    </w:p>
+    <w:p>
+      <w:pPr>
+        <w:tabs>
+          <w:tab w:val="left" w:pos="5790"/>
+        </w:tabs>
+        <w:spacing w:after="0" w:line="240" w:lineRule="auto"/>
+        <w:jc w:val="center"/>
+        <w:rPr>
+          <w:sz w:val="28"/>
+          <w:szCs w:val="28"/>
+        </w:rPr>
+      </w:pPr>
+      <w:r>
+        <w:rPr>
           <w:sz w:val="28"/>
           <w:szCs w:val="28"/>
         </w:rPr>
@@ -269,7 +297,6 @@
       </w:r>
       <w:r>
         <w:rPr>
-          <w:rFonts w:ascii="Times New Roman" w:hAnsi="Times New Roman" w:cs="Times New Roman"/>
           <w:sz w:val="28"/>
           <w:szCs w:val="28"/>
         </w:rPr>
@@ -278,16 +305,18 @@
     </w:p>
     <w:p>
       <w:pPr>
-        <w:spacing w:line="360" w:lineRule="auto"/>
-        <w:rPr>
-          <w:rFonts w:ascii="Times New Roman" w:hAnsi="Times New Roman" w:cs="Times New Roman"/>
-          <w:sz w:val="28"/>
-          <w:szCs w:val="28"/>
-        </w:rPr>
-      </w:pPr>
-      <w:r>
-        <w:rPr>
-          <w:rFonts w:ascii="Times New Roman" w:hAnsi="Times New Roman" w:cs="Times New Roman"/>
+        <w:tabs>
+          <w:tab w:val="left" w:pos="5790"/>
+        </w:tabs>
+        <w:spacing w:after="0" w:line="240" w:lineRule="auto"/>
+        <w:jc w:val="center"/>
+        <w:rPr>
+          <w:sz w:val="28"/>
+          <w:szCs w:val="28"/>
+        </w:rPr>
+      </w:pPr>
+      <w:r>
+        <w:rPr>
           <w:sz w:val="28"/>
           <w:szCs w:val="28"/>
         </w:rPr>
@@ -305,25 +334,24 @@
     </w:p>
     <w:p>
       <w:pPr>
-        <w:spacing w:line="360" w:lineRule="auto"/>
-        <w:rPr>
-          <w:rFonts w:ascii="Times New Roman" w:hAnsi="Times New Roman" w:cs="Times New Roman"/>
-          <w:sz w:val="28"/>
-          <w:szCs w:val="28"/>
-        </w:rPr>
-      </w:pPr>
-      <w:r>
-        <w:rPr>
-          <w:rFonts w:ascii="Times New Roman" w:hAnsi="Times New Roman" w:cs="Times New Roman"/>
+        <w:spacing w:after="0" w:line="240" w:lineRule="auto"/>
+        <w:jc w:val="center"/>
+        <w:rPr>
           <w:b/>
           <w:sz w:val="28"/>
           <w:szCs w:val="28"/>
         </w:rPr>
+      </w:pPr>
+      <w:r>
+        <w:rPr>
+          <w:b/>
+          <w:sz w:val="28"/>
+          <w:szCs w:val="28"/>
+        </w:rPr>
         <w:t xml:space="preserve">ПРАКТИЧЕСКАЯ РАБОТА № </w:t>
       </w:r>
       <w:r>
         <w:rPr>
-          <w:rFonts w:ascii="Times New Roman" w:hAnsi="Times New Roman" w:cs="Times New Roman"/>
           <w:b/>
           <w:sz w:val="28"/>
           <w:szCs w:val="28"/>
@@ -333,16 +361,15 @@
     </w:p>
     <w:p>
       <w:pPr>
-        <w:spacing w:line="360" w:lineRule="auto"/>
-        <w:rPr>
-          <w:rFonts w:ascii="Times New Roman" w:hAnsi="Times New Roman" w:cs="Times New Roman"/>
-          <w:sz w:val="28"/>
-          <w:szCs w:val="28"/>
-        </w:rPr>
-      </w:pPr>
-      <w:r>
-        <w:rPr>
-          <w:rFonts w:ascii="Times New Roman" w:hAnsi="Times New Roman" w:cs="Times New Roman"/>
+        <w:spacing w:after="0" w:line="240" w:lineRule="auto"/>
+        <w:jc w:val="center"/>
+        <w:rPr>
+          <w:sz w:val="28"/>
+          <w:szCs w:val="28"/>
+        </w:rPr>
+      </w:pPr>
+      <w:r>
+        <w:rPr>
           <w:sz w:val="28"/>
           <w:szCs w:val="28"/>
         </w:rPr>
@@ -351,16 +378,15 @@
     </w:p>
     <w:p>
       <w:pPr>
-        <w:spacing w:line="360" w:lineRule="auto"/>
-        <w:rPr>
-          <w:rFonts w:ascii="Times New Roman" w:hAnsi="Times New Roman" w:cs="Times New Roman"/>
-          <w:sz w:val="28"/>
-          <w:szCs w:val="28"/>
-        </w:rPr>
-      </w:pPr>
-      <w:r>
-        <w:rPr>
-          <w:rFonts w:ascii="Times New Roman" w:hAnsi="Times New Roman" w:cs="Times New Roman"/>
+        <w:spacing w:after="0" w:line="240" w:lineRule="auto"/>
+        <w:jc w:val="center"/>
+        <w:rPr>
+          <w:sz w:val="28"/>
+          <w:szCs w:val="28"/>
+        </w:rPr>
+      </w:pPr>
+      <w:r>
+        <w:rPr>
           <w:sz w:val="28"/>
           <w:szCs w:val="28"/>
         </w:rPr>
@@ -386,7 +412,6 @@
       </w:r>
       <w:r>
         <w:rPr>
-          <w:rFonts w:ascii="Times New Roman" w:hAnsi="Times New Roman" w:cs="Times New Roman"/>
           <w:sz w:val="28"/>
           <w:szCs w:val="28"/>
         </w:rPr>
@@ -427,16 +452,16 @@
     </w:p>
     <w:p>
       <w:pPr>
-        <w:spacing w:line="360" w:lineRule="auto"/>
-        <w:rPr>
-          <w:rFonts w:ascii="Times New Roman" w:hAnsi="Times New Roman" w:cs="Times New Roman"/>
-          <w:sz w:val="28"/>
-          <w:szCs w:val="28"/>
-        </w:rPr>
-      </w:pPr>
-      <w:r>
-        <w:rPr>
-          <w:rFonts w:ascii="Times New Roman" w:hAnsi="Times New Roman" w:cs="Times New Roman"/>
+        <w:pStyle w:val="ac"/>
+        <w:spacing w:after="0" w:line="240" w:lineRule="auto"/>
+        <w:ind w:firstLine="0"/>
+        <w:rPr>
+          <w:sz w:val="28"/>
+          <w:szCs w:val="28"/>
+        </w:rPr>
+      </w:pPr>
+      <w:r>
+        <w:rPr>
           <w:sz w:val="28"/>
           <w:szCs w:val="28"/>
         </w:rPr>
@@ -444,7 +469,6 @@
       </w:r>
       <w:r>
         <w:rPr>
-          <w:rFonts w:ascii="Times New Roman" w:hAnsi="Times New Roman" w:cs="Times New Roman"/>
           <w:sz w:val="28"/>
           <w:szCs w:val="28"/>
         </w:rPr>
@@ -452,7 +476,6 @@
       </w:r>
       <w:r>
         <w:rPr>
-          <w:rFonts w:ascii="Times New Roman" w:hAnsi="Times New Roman" w:cs="Times New Roman"/>
           <w:sz w:val="28"/>
           <w:szCs w:val="28"/>
         </w:rPr>
@@ -504,16 +527,16 @@
     </w:p>
     <w:p>
       <w:pPr>
-        <w:spacing w:line="360" w:lineRule="auto"/>
-        <w:rPr>
-          <w:rFonts w:ascii="Times New Roman" w:hAnsi="Times New Roman" w:cs="Times New Roman"/>
-          <w:sz w:val="28"/>
-          <w:szCs w:val="28"/>
-        </w:rPr>
-      </w:pPr>
-      <w:r>
-        <w:rPr>
-          <w:rFonts w:ascii="Times New Roman" w:hAnsi="Times New Roman" w:cs="Times New Roman"/>
+        <w:pStyle w:val="CM35"/>
+        <w:spacing w:after="0" w:line="240" w:lineRule="auto"/>
+        <w:jc w:val="both"/>
+        <w:rPr>
+          <w:sz w:val="28"/>
+          <w:szCs w:val="28"/>
+        </w:rPr>
+      </w:pPr>
+      <w:r>
+        <w:rPr>
           <w:sz w:val="28"/>
           <w:szCs w:val="28"/>
         </w:rPr>
@@ -521,7 +544,6 @@
       </w:r>
       <w:r>
         <w:rPr>
-          <w:rFonts w:ascii="Times New Roman" w:hAnsi="Times New Roman" w:cs="Times New Roman"/>
           <w:sz w:val="28"/>
           <w:szCs w:val="28"/>
         </w:rPr>
@@ -529,7 +551,6 @@
       </w:r>
       <w:r>
         <w:rPr>
-          <w:rFonts w:ascii="Times New Roman" w:hAnsi="Times New Roman" w:cs="Times New Roman"/>
           <w:sz w:val="28"/>
           <w:szCs w:val="28"/>
         </w:rPr>
@@ -537,7 +558,6 @@
       </w:r>
       <w:r>
         <w:rPr>
-          <w:rFonts w:ascii="Times New Roman" w:hAnsi="Times New Roman" w:cs="Times New Roman"/>
           <w:sz w:val="28"/>
           <w:szCs w:val="28"/>
         </w:rPr>
@@ -545,7 +565,6 @@
       </w:r>
       <w:r>
         <w:rPr>
-          <w:rFonts w:ascii="Times New Roman" w:hAnsi="Times New Roman" w:cs="Times New Roman"/>
           <w:sz w:val="28"/>
           <w:szCs w:val="28"/>
         </w:rPr>
@@ -553,7 +572,6 @@
       </w:r>
       <w:r>
         <w:rPr>
-          <w:rFonts w:ascii="Times New Roman" w:hAnsi="Times New Roman" w:cs="Times New Roman"/>
           <w:sz w:val="28"/>
           <w:szCs w:val="28"/>
         </w:rPr>
@@ -561,7 +579,6 @@
       </w:r>
       <w:r>
         <w:rPr>
-          <w:rFonts w:ascii="Times New Roman" w:hAnsi="Times New Roman" w:cs="Times New Roman"/>
           <w:sz w:val="28"/>
           <w:szCs w:val="28"/>
         </w:rPr>
@@ -569,7 +586,6 @@
       </w:r>
       <w:r>
         <w:rPr>
-          <w:rFonts w:ascii="Times New Roman" w:hAnsi="Times New Roman" w:cs="Times New Roman"/>
           <w:sz w:val="28"/>
           <w:szCs w:val="28"/>
         </w:rPr>
@@ -589,16 +605,16 @@
     </w:p>
     <w:p>
       <w:pPr>
-        <w:spacing w:line="360" w:lineRule="auto"/>
-        <w:rPr>
-          <w:rFonts w:ascii="Times New Roman" w:hAnsi="Times New Roman" w:cs="Times New Roman"/>
-          <w:sz w:val="28"/>
-          <w:szCs w:val="28"/>
-        </w:rPr>
-      </w:pPr>
-      <w:r>
-        <w:rPr>
-          <w:rFonts w:ascii="Times New Roman" w:hAnsi="Times New Roman" w:cs="Times New Roman"/>
+        <w:pStyle w:val="CM35"/>
+        <w:spacing w:after="0" w:line="240" w:lineRule="auto"/>
+        <w:ind w:right="-436"/>
+        <w:rPr>
+          <w:sz w:val="28"/>
+          <w:szCs w:val="28"/>
+        </w:rPr>
+      </w:pPr>
+      <w:r>
+        <w:rPr>
           <w:sz w:val="28"/>
           <w:szCs w:val="28"/>
         </w:rPr>
@@ -608,16 +624,15 @@
     <w:p/>
     <w:p>
       <w:pPr>
-        <w:spacing w:line="360" w:lineRule="auto"/>
-        <w:rPr>
-          <w:rFonts w:ascii="Times New Roman" w:hAnsi="Times New Roman" w:cs="Times New Roman"/>
-          <w:sz w:val="28"/>
-          <w:szCs w:val="28"/>
-        </w:rPr>
-      </w:pPr>
-      <w:r>
-        <w:rPr>
-          <w:rFonts w:ascii="Times New Roman" w:hAnsi="Times New Roman" w:cs="Times New Roman"/>
+        <w:pStyle w:val="Default"/>
+        <w:jc w:val="both"/>
+        <w:rPr>
+          <w:sz w:val="28"/>
+          <w:szCs w:val="28"/>
+        </w:rPr>
+      </w:pPr>
+      <w:r>
+        <w:rPr>
           <w:sz w:val="28"/>
           <w:szCs w:val="28"/>
         </w:rPr>
@@ -625,7 +640,6 @@
       </w:r>
       <w:r>
         <w:rPr>
-          <w:rFonts w:ascii="Times New Roman" w:hAnsi="Times New Roman" w:cs="Times New Roman"/>
           <w:sz w:val="28"/>
           <w:szCs w:val="28"/>
         </w:rPr>
@@ -633,7 +647,6 @@
       </w:r>
       <w:r>
         <w:rPr>
-          <w:rFonts w:ascii="Times New Roman" w:hAnsi="Times New Roman" w:cs="Times New Roman"/>
           <w:sz w:val="28"/>
           <w:szCs w:val="28"/>
         </w:rPr>
@@ -641,7 +654,6 @@
       </w:r>
       <w:r>
         <w:rPr>
-          <w:rFonts w:ascii="Times New Roman" w:hAnsi="Times New Roman" w:cs="Times New Roman"/>
           <w:sz w:val="28"/>
           <w:szCs w:val="28"/>
         </w:rPr>
@@ -649,7 +661,6 @@
       </w:r>
       <w:r>
         <w:rPr>
-          <w:rFonts w:ascii="Times New Roman" w:hAnsi="Times New Roman" w:cs="Times New Roman"/>
           <w:sz w:val="28"/>
           <w:szCs w:val="28"/>
         </w:rPr>
@@ -657,7 +668,6 @@
       </w:r>
       <w:r>
         <w:rPr>
-          <w:rFonts w:ascii="Times New Roman" w:hAnsi="Times New Roman" w:cs="Times New Roman"/>
           <w:sz w:val="28"/>
           <w:szCs w:val="28"/>
         </w:rPr>
@@ -665,7 +675,6 @@
       </w:r>
       <w:r>
         <w:rPr>
-          <w:rFonts w:ascii="Times New Roman" w:hAnsi="Times New Roman" w:cs="Times New Roman"/>
           <w:sz w:val="28"/>
           <w:szCs w:val="28"/>
         </w:rPr>
@@ -695,16 +704,20 @@
     </w:p>
     <w:p>
       <w:pPr>
-        <w:spacing w:line="360" w:lineRule="auto"/>
-        <w:rPr>
-          <w:rFonts w:ascii="Times New Roman" w:hAnsi="Times New Roman" w:cs="Times New Roman"/>
-          <w:sz w:val="28"/>
-          <w:szCs w:val="28"/>
-        </w:rPr>
-      </w:pPr>
-      <w:r>
-        <w:rPr>
-          <w:rFonts w:ascii="Times New Roman" w:hAnsi="Times New Roman" w:cs="Times New Roman"/>
+        <w:pStyle w:val="ac"/>
+        <w:tabs>
+          <w:tab w:val="right" w:leader="underscore" w:pos="9072"/>
+        </w:tabs>
+        <w:spacing w:after="0" w:line="240" w:lineRule="auto"/>
+        <w:ind w:firstLine="0"/>
+        <w:jc w:val="left"/>
+        <w:rPr>
+          <w:sz w:val="28"/>
+          <w:szCs w:val="28"/>
+        </w:rPr>
+      </w:pPr>
+      <w:r>
+        <w:rPr>
           <w:sz w:val="28"/>
           <w:szCs w:val="28"/>
         </w:rPr>
@@ -712,7 +725,6 @@
       </w:r>
       <w:r>
         <w:rPr>
-          <w:rFonts w:ascii="Times New Roman" w:hAnsi="Times New Roman" w:cs="Times New Roman"/>
           <w:iCs/>
           <w:sz w:val="28"/>
           <w:szCs w:val="28"/>
@@ -721,7 +733,6 @@
       </w:r>
       <w:r>
         <w:rPr>
-          <w:rFonts w:ascii="Times New Roman" w:hAnsi="Times New Roman" w:cs="Times New Roman"/>
           <w:sz w:val="28"/>
           <w:szCs w:val="28"/>
         </w:rPr>
@@ -729,7 +740,6 @@
       </w:r>
       <w:r>
         <w:rPr>
-          <w:rFonts w:ascii="Times New Roman" w:hAnsi="Times New Roman" w:cs="Times New Roman"/>
           <w:sz w:val="28"/>
           <w:szCs w:val="28"/>
           <w:u w:val="single"/>
@@ -738,7 +748,6 @@
       </w:r>
       <w:r>
         <w:rPr>
-          <w:rFonts w:ascii="Times New Roman" w:hAnsi="Times New Roman" w:cs="Times New Roman"/>
           <w:sz w:val="28"/>
           <w:szCs w:val="28"/>
         </w:rPr>
@@ -805,16 +814,14 @@
     </w:p>
     <w:p>
       <w:pPr>
-        <w:spacing w:line="360" w:lineRule="auto"/>
-        <w:rPr>
-          <w:rFonts w:ascii="Times New Roman" w:hAnsi="Times New Roman" w:cs="Times New Roman"/>
-          <w:sz w:val="28"/>
-          <w:szCs w:val="28"/>
-        </w:rPr>
-      </w:pPr>
-      <w:r>
-        <w:rPr>
-          <w:rFonts w:ascii="Times New Roman" w:hAnsi="Times New Roman" w:cs="Times New Roman"/>
+        <w:spacing w:after="0" w:line="240" w:lineRule="auto"/>
+        <w:rPr>
+          <w:sz w:val="28"/>
+          <w:szCs w:val="28"/>
+        </w:rPr>
+      </w:pPr>
+      <w:r>
+        <w:rPr>
           <w:sz w:val="28"/>
           <w:szCs w:val="28"/>
         </w:rPr>
@@ -823,7 +830,6 @@
       <w:proofErr w:type="spellStart"/>
       <w:r>
         <w:rPr>
-          <w:rFonts w:ascii="Times New Roman" w:hAnsi="Times New Roman" w:cs="Times New Roman"/>
           <w:sz w:val="28"/>
           <w:szCs w:val="28"/>
           <w:u w:val="single"/>
@@ -833,7 +839,6 @@
       <w:proofErr w:type="spellEnd"/>
       <w:r>
         <w:rPr>
-          <w:rFonts w:ascii="Times New Roman" w:hAnsi="Times New Roman" w:cs="Times New Roman"/>
           <w:sz w:val="28"/>
           <w:szCs w:val="28"/>
           <w:u w:val="single"/>
@@ -842,7 +847,6 @@
       </w:r>
       <w:r>
         <w:rPr>
-          <w:rFonts w:ascii="Times New Roman" w:hAnsi="Times New Roman" w:cs="Times New Roman"/>
           <w:sz w:val="28"/>
           <w:szCs w:val="28"/>
         </w:rPr>
@@ -895,16 +899,14 @@
     </w:p>
     <w:p>
       <w:pPr>
-        <w:spacing w:line="360" w:lineRule="auto"/>
-        <w:rPr>
-          <w:rFonts w:ascii="Times New Roman" w:hAnsi="Times New Roman" w:cs="Times New Roman"/>
-          <w:sz w:val="28"/>
-          <w:szCs w:val="28"/>
-        </w:rPr>
-      </w:pPr>
-      <w:r>
-        <w:rPr>
-          <w:rFonts w:ascii="Times New Roman" w:hAnsi="Times New Roman" w:cs="Times New Roman"/>
+        <w:spacing w:after="0" w:line="240" w:lineRule="auto"/>
+        <w:rPr>
+          <w:sz w:val="28"/>
+          <w:szCs w:val="28"/>
+        </w:rPr>
+      </w:pPr>
+      <w:r>
+        <w:rPr>
           <w:sz w:val="28"/>
           <w:szCs w:val="28"/>
         </w:rPr>
@@ -912,7 +914,6 @@
       </w:r>
       <w:r>
         <w:rPr>
-          <w:rFonts w:ascii="Times New Roman" w:hAnsi="Times New Roman" w:cs="Times New Roman"/>
           <w:sz w:val="28"/>
           <w:szCs w:val="28"/>
         </w:rPr>
@@ -921,7 +922,6 @@
       </w:r>
       <w:r>
         <w:rPr>
-          <w:rFonts w:ascii="Times New Roman" w:hAnsi="Times New Roman" w:cs="Times New Roman"/>
           <w:sz w:val="28"/>
           <w:szCs w:val="28"/>
         </w:rPr>
@@ -929,7 +929,6 @@
       </w:r>
       <w:r>
         <w:rPr>
-          <w:rFonts w:ascii="Times New Roman" w:hAnsi="Times New Roman" w:cs="Times New Roman"/>
           <w:sz w:val="28"/>
           <w:szCs w:val="28"/>
         </w:rPr>
@@ -937,7 +936,6 @@
       </w:r>
       <w:r>
         <w:rPr>
-          <w:rFonts w:ascii="Times New Roman" w:hAnsi="Times New Roman" w:cs="Times New Roman"/>
           <w:sz w:val="28"/>
           <w:szCs w:val="28"/>
         </w:rPr>
@@ -956,16 +954,14 @@
     </w:p>
     <w:p>
       <w:pPr>
-        <w:spacing w:line="360" w:lineRule="auto"/>
-        <w:rPr>
-          <w:rFonts w:ascii="Times New Roman" w:hAnsi="Times New Roman" w:cs="Times New Roman"/>
-          <w:sz w:val="28"/>
-          <w:szCs w:val="28"/>
-        </w:rPr>
-      </w:pPr>
-      <w:r>
-        <w:rPr>
-          <w:rFonts w:ascii="Times New Roman" w:hAnsi="Times New Roman" w:cs="Times New Roman"/>
+        <w:spacing w:after="0" w:line="240" w:lineRule="auto"/>
+        <w:rPr>
+          <w:sz w:val="28"/>
+          <w:szCs w:val="28"/>
+        </w:rPr>
+      </w:pPr>
+      <w:r>
+        <w:rPr>
           <w:sz w:val="28"/>
           <w:szCs w:val="28"/>
         </w:rPr>
@@ -973,7 +969,6 @@
       </w:r>
       <w:r>
         <w:rPr>
-          <w:rFonts w:ascii="Times New Roman" w:hAnsi="Times New Roman" w:cs="Times New Roman"/>
           <w:bCs/>
           <w:sz w:val="28"/>
           <w:szCs w:val="28"/>
@@ -982,7 +977,6 @@
       </w:r>
       <w:r>
         <w:rPr>
-          <w:rFonts w:ascii="Times New Roman" w:hAnsi="Times New Roman" w:cs="Times New Roman"/>
           <w:sz w:val="28"/>
           <w:szCs w:val="28"/>
         </w:rPr>
@@ -1021,16 +1015,15 @@
     </w:p>
     <w:p>
       <w:pPr>
-        <w:spacing w:line="360" w:lineRule="auto"/>
-        <w:rPr>
-          <w:rFonts w:ascii="Times New Roman" w:hAnsi="Times New Roman" w:cs="Times New Roman"/>
-          <w:sz w:val="28"/>
-          <w:szCs w:val="28"/>
-        </w:rPr>
-      </w:pPr>
-      <w:r>
-        <w:rPr>
-          <w:rFonts w:ascii="Times New Roman" w:hAnsi="Times New Roman" w:cs="Times New Roman"/>
+        <w:spacing w:after="0" w:line="240" w:lineRule="auto"/>
+        <w:jc w:val="center"/>
+        <w:rPr>
+          <w:sz w:val="28"/>
+          <w:szCs w:val="28"/>
+        </w:rPr>
+      </w:pPr>
+      <w:r>
+        <w:rPr>
           <w:sz w:val="28"/>
           <w:szCs w:val="28"/>
         </w:rPr>
@@ -1039,16 +1032,15 @@
     </w:p>
     <w:p>
       <w:pPr>
-        <w:spacing w:line="360" w:lineRule="auto"/>
-        <w:rPr>
-          <w:rFonts w:ascii="Times New Roman" w:hAnsi="Times New Roman" w:cs="Times New Roman"/>
-          <w:sz w:val="28"/>
-          <w:szCs w:val="28"/>
-        </w:rPr>
-      </w:pPr>
-      <w:r>
-        <w:rPr>
-          <w:rFonts w:ascii="Times New Roman" w:hAnsi="Times New Roman" w:cs="Times New Roman"/>
+        <w:spacing w:after="0" w:line="240" w:lineRule="auto"/>
+        <w:jc w:val="center"/>
+        <w:rPr>
+          <w:sz w:val="28"/>
+          <w:szCs w:val="28"/>
+        </w:rPr>
+      </w:pPr>
+      <w:r>
+        <w:rPr>
           <w:sz w:val="28"/>
           <w:szCs w:val="28"/>
         </w:rPr>
@@ -1368,7 +1360,7 @@
         </w:rPr>
         <w:drawing>
           <wp:inline distT="0" distB="0" distL="0" distR="0" wp14:anchorId="77CCAD79" wp14:editId="4579A90D">
-            <wp:extent cx="5500000" cy="2683687"/>
+            <wp:extent cx="5940425" cy="2508250"/>
             <wp:effectExtent l="0" t="0" r="3175" b="6350"/>
             <wp:docPr id="565592645" name="Рисунок 1"/>
             <wp:cNvGraphicFramePr>
@@ -1390,7 +1382,7 @@
                   <pic:spPr>
                     <a:xfrm>
                       <a:off x="0" y="0"/>
-                      <a:ext cx="5500000" cy="2683687"/>
+                      <a:ext cx="5940425" cy="2508250"/>
                     </a:xfrm>
                     <a:prstGeom prst="rect">
                       <a:avLst/>
@@ -1439,6 +1431,14 @@
           <w:szCs w:val="28"/>
         </w:rPr>
       </w:pPr>
+      <w:r>
+        <w:rPr>
+          <w:rFonts w:ascii="Times New Roman" w:hAnsi="Times New Roman" w:cs="Times New Roman"/>
+          <w:sz w:val="28"/>
+          <w:szCs w:val="28"/>
+        </w:rPr>
+        <w:t>С помощью команды echo был создан альтернативный поток данных файла silin.txt, содержащий путь к графическому файлу BMP. Для просмотра содержимого потока использовалась команда more &lt; silin.txt:potok2, которая вывела сохранённый путь к изображению. Открытие содержимого потока в программе Paint подтвердило корректность записи бинарных данных в альтернативный поток NTFS.</w:t>
+      </w:r>
     </w:p>
     <w:p>
       <w:pPr>
@@ -1455,32 +1455,14 @@
           <w:sz w:val="28"/>
           <w:szCs w:val="28"/>
         </w:rPr>
-        <w:t>С помощью команды echo был создан альтернативный поток данных файла silin.txt, содержащий путь к графическому файлу BMP. Для просмотра содержимого потока использовалась команда more &lt; silin.txt:potok2, которая вывела сохранённый путь к изображению. Открытие содержимого потока в программе Paint подтвердило корректность записи бинарных данных в альтернативный поток NTFS: изображение отобразилось без искажений, что демонстрирует возможность сокрытия произвольных данных в потоках файловой системы.</w:t>
-      </w:r>
-    </w:p>
-    <w:p>
-      <w:pPr>
-        <w:spacing w:line="360" w:lineRule="auto"/>
-        <w:rPr>
-          <w:rFonts w:ascii="Times New Roman" w:hAnsi="Times New Roman" w:cs="Times New Roman"/>
-          <w:sz w:val="28"/>
-          <w:szCs w:val="28"/>
-        </w:rPr>
-      </w:pPr>
+        <w:t xml:space="preserve">Вывод списка всех потоков данных файла silin.txt. Содержимое файла silin.txt и потока potok1.txt</w:t>
+      </w:r>
       <w:proofErr w:type="spellStart"/>
       <w:proofErr w:type="spellEnd"/>
       <w:proofErr w:type="spellStart"/>
       <w:proofErr w:type="spellEnd"/>
       <w:proofErr w:type="spellStart"/>
       <w:proofErr w:type="spellEnd"/>
-      <w:r>
-        <w:rPr>
-          <w:rFonts w:ascii="Times New Roman" w:hAnsi="Times New Roman" w:cs="Times New Roman"/>
-          <w:sz w:val="28"/>
-          <w:szCs w:val="28"/>
-        </w:rPr>
-        <w:t>Вывод списка всех потоков данных файла silin.txt с помощью команды dir /r показал наличие основного потока данных (:$DATA) и созданных альтернативных потоков potok1.txt и potok2. Команда more &lt; silin.txt:potok1.txt позволила прочитать содержимое альтернативного потока, не затрагивая основной поток файла.</w:t>
-      </w:r>
     </w:p>
     <w:p>
       <w:pPr>
@@ -1502,7 +1484,7 @@
         <w:lastRenderedPageBreak/>
         <w:drawing>
           <wp:inline distT="0" distB="0" distL="0" distR="0" wp14:anchorId="230DF5FF" wp14:editId="2A7BA533">
-            <wp:extent cx="5500000" cy="2110625"/>
+            <wp:extent cx="5386726" cy="5040351"/>
             <wp:effectExtent l="0" t="0" r="0" b="1905"/>
             <wp:docPr id="940500614" name="Рисунок 1"/>
             <wp:cNvGraphicFramePr>
@@ -1524,7 +1506,7 @@
                   <pic:spPr>
                     <a:xfrm>
                       <a:off x="0" y="0"/>
-                      <a:ext cx="5500000" cy="2110625"/>
+                      <a:ext cx="5394280" cy="5047419"/>
                     </a:xfrm>
                     <a:prstGeom prst="rect">
                       <a:avLst/>
@@ -1648,83 +1630,102 @@
           <w:szCs w:val="28"/>
         </w:rPr>
         <w:lastRenderedPageBreak/>
-        <w:t>Метаинформация файла egor.txt</w:t>
-      </w:r>
-    </w:p>
-    <w:p>
-      <w:pPr>
-        <w:spacing w:line="360" w:lineRule="auto"/>
-        <w:rPr>
-          <w:rFonts w:ascii="Times New Roman" w:hAnsi="Times New Roman" w:cs="Times New Roman"/>
-          <w:sz w:val="28"/>
-          <w:szCs w:val="28"/>
-        </w:rPr>
-      </w:pPr>
-      <w:r>
-        <w:rPr>
-          <w:rFonts w:ascii="Times New Roman" w:hAnsi="Times New Roman" w:cs="Times New Roman"/>
-          <w:sz w:val="28"/>
-          <w:szCs w:val="28"/>
-        </w:rPr>
-        <w:t>С помощью утилиты istat из пакета The Sleuth Kit был проведён анализ MFT-записи файла egor.txt. Команда istat &lt;образ_диска&gt; &lt;inode&gt; вернула полный набор атрибутов: уникальный номер индексного узла, тип файла (regular), права доступа, размер файла в байтах. В блоке $STANDARD_INFORMATION были отображены четыре временны́е метки: Created (дата создания), File Modified (дата последнего изменения содержимого), MFT Modified (дата изменения записи в таблице MFT) и Accessed (дата последнего чтения). Атрибут $FILE_NAME содержал имя файла в файловой системе, родительский inode директории и дублирующий набор временны́х меток, который сложнее фальсифицировать. Совокупность этих данных позволяет точно восстановить хронологию операций с файлом.</w:t>
-      </w:r>
-    </w:p>
-    <w:p>
-      <w:pPr>
-        <w:spacing w:line="360" w:lineRule="auto"/>
+        <w:t xml:space="preserve">Метаинформация файла </w:t>
+      </w:r>
+      <w:r>
         <w:rPr>
           <w:rFonts w:ascii="Times New Roman" w:hAnsi="Times New Roman" w:cs="Times New Roman"/>
           <w:sz w:val="28"/>
           <w:szCs w:val="28"/>
           <w:lang w:val="en-US"/>
         </w:rPr>
-      </w:pPr>
-    </w:p>
-    <w:p>
-      <w:pPr>
-        <w:rPr>
-          <w:rFonts w:ascii="Times New Roman" w:hAnsi="Times New Roman" w:cs="Times New Roman"/>
-          <w:sz w:val="28"/>
-          <w:szCs w:val="28"/>
-        </w:rPr>
-      </w:pPr>
-      <w:r>
-        <w:rPr>
-          <w:rFonts w:ascii="Times New Roman" w:hAnsi="Times New Roman" w:cs="Times New Roman"/>
-          <w:sz w:val="28"/>
-          <w:szCs w:val="28"/>
-        </w:rPr>
-        <w:t>Метаинформация файла silin.txt</w:t>
-      </w:r>
-    </w:p>
-    <w:p>
-      <w:pPr>
-        <w:spacing w:line="360" w:lineRule="auto"/>
-        <w:rPr>
-          <w:rFonts w:ascii="Times New Roman" w:hAnsi="Times New Roman" w:cs="Times New Roman"/>
-          <w:sz w:val="28"/>
-          <w:szCs w:val="28"/>
-        </w:rPr>
-      </w:pPr>
-      <w:r>
-        <w:rPr>
-          <w:rFonts w:ascii="Times New Roman" w:hAnsi="Times New Roman" w:cs="Times New Roman"/>
-          <w:sz w:val="28"/>
-          <w:szCs w:val="28"/>
-        </w:rPr>
-        <w:t>Аналогичный анализ был проведён для файла silin.txt. Вывод istat показал идентичную структуру MFT-записи с отдельным уникальным номером inode. Сравнение атрибутов двух файлов (egor.txt и silin.txt) позволило установить: каждый файл хранит независимые временны́е метки, номера блоков данных и счётчики жёстких ссылок. Атрибут $DATA содержал информацию о реальном расположении содержимого файла на диске — номера кластеров и смещения. Это подтверждает, что файловая система NTFS ведёт детальный учёт метаданных для каждого объекта, что делает возможным криминалистический анализ даже после удаления файлов.</w:t>
-      </w:r>
-    </w:p>
-    <w:p>
-      <w:pPr>
-        <w:spacing w:line="360" w:lineRule="auto"/>
-        <w:rPr>
-          <w:rFonts w:ascii="Times New Roman" w:hAnsi="Times New Roman" w:cs="Times New Roman"/>
-          <w:sz w:val="28"/>
-          <w:szCs w:val="28"/>
-          <w:lang w:val="en-US"/>
-        </w:rPr>
-      </w:pPr>
+        <w:t>egor.txt</w:t>
+      </w:r>
+    </w:p>
+    <w:p>
+      <w:pPr>
+        <w:rPr>
+          <w:rFonts w:ascii="Times New Roman" w:hAnsi="Times New Roman" w:cs="Times New Roman"/>
+          <w:sz w:val="28"/>
+          <w:szCs w:val="28"/>
+        </w:rPr>
+      </w:pPr>
+      <w:r>
+        <w:rPr>
+          <w:rFonts w:ascii="Times New Roman" w:hAnsi="Times New Roman" w:cs="Times New Roman"/>
+          <w:sz w:val="28"/>
+          <w:szCs w:val="28"/>
+        </w:rPr>
+        <w:t>С помощью утилиты istat из пакета The Sleuth Kit был проведён анализ MFT-записи файла egor.txt. Команда istat &lt;образ_диска&gt; &lt;inode&gt; вернула полный набор атрибутов: уникальный номер индексного узла, тип файла, права доступа, размер файла в байтах. В блоке $STANDARD_INFORMATION отображены четыре временны́е метки: Created (дата создания), File Modified (дата последнего изменения содержимого), MFT Modified (дата изменения записи в таблице MFT) и Accessed (дата последнего чтения). Атрибут $FILE_NAME содержал имя файла в файловой системе, родительский inode директории и дублирующий набор временны́х меток.</w:t>
+      </w:r>
+    </w:p>
+    <w:p>
+      <w:pPr>
+        <w:rPr>
+          <w:rFonts w:ascii="Times New Roman" w:hAnsi="Times New Roman" w:cs="Times New Roman"/>
+          <w:sz w:val="28"/>
+          <w:szCs w:val="28"/>
+        </w:rPr>
+      </w:pPr>
+      <w:r>
+        <w:rPr>
+          <w:rFonts w:ascii="Times New Roman" w:hAnsi="Times New Roman" w:cs="Times New Roman"/>
+          <w:sz w:val="28"/>
+          <w:szCs w:val="28"/>
+        </w:rPr>
+        <w:t>С помощью команды ifind из пакета The Sleuth Kit был определён номер индексного узла (inode) файла silin.txt. Команда ifind выполнила поиск по образу диска и вернула inode number исследуемого файла. Полученный номер использовался для дальнейшего анализа атрибутов MFT-записи с помощью утилиты istat.</w:t>
+      </w:r>
+    </w:p>
+    <w:p>
+      <w:pPr>
+        <w:rPr>
+          <w:rFonts w:ascii="Times New Roman" w:hAnsi="Times New Roman" w:cs="Times New Roman"/>
+          <w:sz w:val="28"/>
+          <w:szCs w:val="28"/>
+        </w:rPr>
+      </w:pPr>
+      <w:r>
+        <w:rPr>
+          <w:rFonts w:ascii="Times New Roman" w:hAnsi="Times New Roman" w:cs="Times New Roman"/>
+          <w:sz w:val="28"/>
+          <w:szCs w:val="28"/>
+        </w:rPr>
+        <w:t xml:space="preserve">Метаинформация файла silin.txt</w:t>
+      </w:r>
+    </w:p>
+    <w:p>
+      <w:pPr>
+        <w:rPr>
+          <w:rFonts w:ascii="Times New Roman" w:hAnsi="Times New Roman" w:cs="Times New Roman"/>
+          <w:sz w:val="28"/>
+          <w:szCs w:val="28"/>
+        </w:rPr>
+      </w:pPr>
+      <w:r>
+        <w:rPr>
+          <w:rFonts w:ascii="Times New Roman" w:hAnsi="Times New Roman" w:cs="Times New Roman"/>
+          <w:sz w:val="28"/>
+          <w:szCs w:val="28"/>
+        </w:rPr>
+        <w:t>Аналогичный анализ был проведён для файла silin.txt. Сравнение атрибутов двух файлов (egor.txt и silin.txt) позволило установить: каждый файл хранит независимые временны́е метки, номера блоков данных и счётчики жёстких ссылок. Атрибут $DATA содержал информацию о реальном расположении содержимого файла на диске — номера кластеров и смещения. Это подтверждает, что файловая система NTFS ведёт детальный учёт метаданных для каждого объекта.</w:t>
+      </w:r>
+    </w:p>
+    <w:p>
+      <w:pPr>
+        <w:rPr>
+          <w:rFonts w:ascii="Times New Roman" w:hAnsi="Times New Roman" w:cs="Times New Roman"/>
+          <w:sz w:val="28"/>
+          <w:szCs w:val="28"/>
+        </w:rPr>
+      </w:pPr>
+      <w:r>
+        <w:rPr>
+          <w:rFonts w:ascii="Times New Roman" w:hAnsi="Times New Roman" w:cs="Times New Roman"/>
+          <w:sz w:val="28"/>
+          <w:szCs w:val="28"/>
+        </w:rPr>
+        <w:t>Аналогичная операция была выполнена для файла egor.txt. Утилита istat вернула полный набор атрибутов MFT-записи: временны́е метки $STANDARD_INFORMATION (Created, Modified, Accessed, Changed), атрибуты $FILE_NAME с именем файла и родительским inode директории, а также информацию о блоках хранения данных на диске.</w:t>
+      </w:r>
     </w:p>
     <w:p>
       <w:pPr>

</xml_diff>